<commit_message>
Document the LLM intent reader and its guards in the technical doc and security report
</commit_message>
<xml_diff>
--- a/docs/submission/source/Larpathon_1_TechnicalDoc.docx
+++ b/docs/submission/source/Larpathon_1_TechnicalDoc.docx
@@ -538,7 +538,7 @@
       <w:pPr>
         <w:pStyle w:val="Heading1"/>
       </w:pPr>
-      <w:bookmarkStart w:id="0" w:name="_Toc243341607"/>
+      <w:bookmarkStart w:id="0" w:name="_Toc243424291"/>
       <w:r>
         <w:lastRenderedPageBreak/>
         <w:t>Document Control</w:t>
@@ -868,7 +868,6 @@
               <w:ind w:firstLine="0"/>
             </w:pPr>
             <w:r>
-              <w:rPr/>
               <w:t>388b1067737f660c17eadb497dff21c396259cb1</w:t>
             </w:r>
           </w:p>
@@ -913,7 +912,7 @@
       <w:pPr>
         <w:pStyle w:val="Heading1"/>
       </w:pPr>
-      <w:bookmarkStart w:id="1" w:name="_Toc243341608"/>
+      <w:bookmarkStart w:id="1" w:name="_Toc243424292"/>
       <w:r>
         <w:t>Executive Proposal Summary</w:t>
       </w:r>
@@ -957,7 +956,7 @@
       <w:pPr>
         <w:pStyle w:val="Heading1"/>
       </w:pPr>
-      <w:bookmarkStart w:id="2" w:name="_Toc243341609"/>
+      <w:bookmarkStart w:id="2" w:name="_Toc243424293"/>
       <w:r>
         <w:lastRenderedPageBreak/>
         <w:t>Table of Contents</w:t>
@@ -997,7 +996,6 @@
               <w:tab w:val="right" w:leader="dot" w:pos="8494"/>
             </w:tabs>
             <w:ind w:firstLine="0"/>
-            <w:jc w:val="left"/>
             <w:rPr>
               <w:rFonts w:asciiTheme="minorHAnsi" w:eastAsiaTheme="minorEastAsia" w:hAnsiTheme="minorHAnsi" w:cstheme="minorBidi"/>
               <w:noProof/>
@@ -1017,7 +1015,7 @@
           <w:r>
             <w:fldChar w:fldCharType="separate"/>
           </w:r>
-          <w:hyperlink w:anchor="_Toc243341607" w:history="1">
+          <w:hyperlink w:anchor="_Toc243424291" w:history="1">
             <w:r>
               <w:rPr>
                 <w:rStyle w:val="Hyperlink"/>
@@ -1044,7 +1042,7 @@
                 <w:noProof/>
                 <w:webHidden/>
               </w:rPr>
-              <w:instrText xml:space="preserve"> PAGEREF _Toc243341607 \h </w:instrText>
+              <w:instrText xml:space="preserve"> PAGEREF _Toc243424291 \h </w:instrText>
             </w:r>
             <w:r>
               <w:rPr>
@@ -1082,7 +1080,6 @@
               <w:tab w:val="right" w:leader="dot" w:pos="8494"/>
             </w:tabs>
             <w:ind w:firstLine="0"/>
-            <w:jc w:val="left"/>
             <w:rPr>
               <w:rFonts w:asciiTheme="minorHAnsi" w:eastAsiaTheme="minorEastAsia" w:hAnsiTheme="minorHAnsi" w:cstheme="minorBidi"/>
               <w:noProof/>
@@ -1093,7 +1090,7 @@
               <w14:ligatures w14:val="standardContextual"/>
             </w:rPr>
           </w:pPr>
-          <w:hyperlink w:anchor="_Toc243341608" w:history="1">
+          <w:hyperlink w:anchor="_Toc243424292" w:history="1">
             <w:r>
               <w:rPr>
                 <w:rStyle w:val="Hyperlink"/>
@@ -1120,7 +1117,7 @@
                 <w:noProof/>
                 <w:webHidden/>
               </w:rPr>
-              <w:instrText xml:space="preserve"> PAGEREF _Toc243341608 \h </w:instrText>
+              <w:instrText xml:space="preserve"> PAGEREF _Toc243424292 \h </w:instrText>
             </w:r>
             <w:r>
               <w:rPr>
@@ -1158,7 +1155,6 @@
               <w:tab w:val="right" w:leader="dot" w:pos="8494"/>
             </w:tabs>
             <w:ind w:firstLine="0"/>
-            <w:jc w:val="left"/>
             <w:rPr>
               <w:rFonts w:asciiTheme="minorHAnsi" w:eastAsiaTheme="minorEastAsia" w:hAnsiTheme="minorHAnsi" w:cstheme="minorBidi"/>
               <w:noProof/>
@@ -1169,7 +1165,7 @@
               <w14:ligatures w14:val="standardContextual"/>
             </w:rPr>
           </w:pPr>
-          <w:hyperlink w:anchor="_Toc243341609" w:history="1">
+          <w:hyperlink w:anchor="_Toc243424293" w:history="1">
             <w:r>
               <w:rPr>
                 <w:rStyle w:val="Hyperlink"/>
@@ -1196,7 +1192,7 @@
                 <w:noProof/>
                 <w:webHidden/>
               </w:rPr>
-              <w:instrText xml:space="preserve"> PAGEREF _Toc243341609 \h </w:instrText>
+              <w:instrText xml:space="preserve"> PAGEREF _Toc243424293 \h </w:instrText>
             </w:r>
             <w:r>
               <w:rPr>
@@ -1234,7 +1230,6 @@
               <w:tab w:val="right" w:leader="dot" w:pos="8494"/>
             </w:tabs>
             <w:ind w:firstLine="0"/>
-            <w:jc w:val="left"/>
             <w:rPr>
               <w:rFonts w:asciiTheme="minorHAnsi" w:eastAsiaTheme="minorEastAsia" w:hAnsiTheme="minorHAnsi" w:cstheme="minorBidi"/>
               <w:noProof/>
@@ -1245,7 +1240,7 @@
               <w14:ligatures w14:val="standardContextual"/>
             </w:rPr>
           </w:pPr>
-          <w:hyperlink w:anchor="_Toc243341610" w:history="1">
+          <w:hyperlink w:anchor="_Toc243424294" w:history="1">
             <w:r>
               <w:rPr>
                 <w:rStyle w:val="Hyperlink"/>
@@ -1272,7 +1267,7 @@
                 <w:noProof/>
                 <w:webHidden/>
               </w:rPr>
-              <w:instrText xml:space="preserve"> PAGEREF _Toc243341610 \h </w:instrText>
+              <w:instrText xml:space="preserve"> PAGEREF _Toc243424294 \h </w:instrText>
             </w:r>
             <w:r>
               <w:rPr>
@@ -1308,8 +1303,9 @@
             <w:pStyle w:val="TOC2"/>
             <w:tabs>
               <w:tab w:val="clear" w:pos="1440"/>
-              <w:tab w:val="left" w:pos="1134"/>
+              <w:tab w:val="left" w:pos="851"/>
             </w:tabs>
+            <w:ind w:left="284"/>
             <w:rPr>
               <w:rFonts w:asciiTheme="minorHAnsi" w:eastAsiaTheme="minorEastAsia" w:hAnsiTheme="minorHAnsi" w:cstheme="minorBidi"/>
               <w:noProof/>
@@ -1320,7 +1316,7 @@
               <w14:ligatures w14:val="standardContextual"/>
             </w:rPr>
           </w:pPr>
-          <w:hyperlink w:anchor="_Toc243341611" w:history="1">
+          <w:hyperlink w:anchor="_Toc243424295" w:history="1">
             <w:r>
               <w:rPr>
                 <w:rStyle w:val="Hyperlink"/>
@@ -1366,7 +1362,7 @@
                 <w:noProof/>
                 <w:webHidden/>
               </w:rPr>
-              <w:instrText xml:space="preserve"> PAGEREF _Toc243341611 \h </w:instrText>
+              <w:instrText xml:space="preserve"> PAGEREF _Toc243424295 \h </w:instrText>
             </w:r>
             <w:r>
               <w:rPr>
@@ -1402,8 +1398,9 @@
             <w:pStyle w:val="TOC2"/>
             <w:tabs>
               <w:tab w:val="clear" w:pos="1440"/>
-              <w:tab w:val="left" w:pos="1134"/>
+              <w:tab w:val="left" w:pos="851"/>
             </w:tabs>
+            <w:ind w:left="284"/>
             <w:rPr>
               <w:rFonts w:asciiTheme="minorHAnsi" w:eastAsiaTheme="minorEastAsia" w:hAnsiTheme="minorHAnsi" w:cstheme="minorBidi"/>
               <w:noProof/>
@@ -1414,7 +1411,7 @@
               <w14:ligatures w14:val="standardContextual"/>
             </w:rPr>
           </w:pPr>
-          <w:hyperlink w:anchor="_Toc243341612" w:history="1">
+          <w:hyperlink w:anchor="_Toc243424296" w:history="1">
             <w:r>
               <w:rPr>
                 <w:rStyle w:val="Hyperlink"/>
@@ -1460,7 +1457,7 @@
                 <w:noProof/>
                 <w:webHidden/>
               </w:rPr>
-              <w:instrText xml:space="preserve"> PAGEREF _Toc243341612 \h </w:instrText>
+              <w:instrText xml:space="preserve"> PAGEREF _Toc243424296 \h </w:instrText>
             </w:r>
             <w:r>
               <w:rPr>
@@ -1496,8 +1493,9 @@
             <w:pStyle w:val="TOC2"/>
             <w:tabs>
               <w:tab w:val="clear" w:pos="1440"/>
-              <w:tab w:val="left" w:pos="1134"/>
+              <w:tab w:val="left" w:pos="851"/>
             </w:tabs>
+            <w:ind w:left="284"/>
             <w:rPr>
               <w:rFonts w:asciiTheme="minorHAnsi" w:eastAsiaTheme="minorEastAsia" w:hAnsiTheme="minorHAnsi" w:cstheme="minorBidi"/>
               <w:noProof/>
@@ -1508,7 +1506,7 @@
               <w14:ligatures w14:val="standardContextual"/>
             </w:rPr>
           </w:pPr>
-          <w:hyperlink w:anchor="_Toc243341613" w:history="1">
+          <w:hyperlink w:anchor="_Toc243424297" w:history="1">
             <w:r>
               <w:rPr>
                 <w:rStyle w:val="Hyperlink"/>
@@ -1554,7 +1552,7 @@
                 <w:noProof/>
                 <w:webHidden/>
               </w:rPr>
-              <w:instrText xml:space="preserve"> PAGEREF _Toc243341613 \h </w:instrText>
+              <w:instrText xml:space="preserve"> PAGEREF _Toc243424297 \h </w:instrText>
             </w:r>
             <w:r>
               <w:rPr>
@@ -1590,8 +1588,9 @@
             <w:pStyle w:val="TOC2"/>
             <w:tabs>
               <w:tab w:val="clear" w:pos="1440"/>
-              <w:tab w:val="left" w:pos="1134"/>
+              <w:tab w:val="left" w:pos="851"/>
             </w:tabs>
+            <w:ind w:left="284"/>
             <w:rPr>
               <w:rFonts w:asciiTheme="minorHAnsi" w:eastAsiaTheme="minorEastAsia" w:hAnsiTheme="minorHAnsi" w:cstheme="minorBidi"/>
               <w:noProof/>
@@ -1602,7 +1601,7 @@
               <w14:ligatures w14:val="standardContextual"/>
             </w:rPr>
           </w:pPr>
-          <w:hyperlink w:anchor="_Toc243341614" w:history="1">
+          <w:hyperlink w:anchor="_Toc243424298" w:history="1">
             <w:r>
               <w:rPr>
                 <w:rStyle w:val="Hyperlink"/>
@@ -1648,7 +1647,7 @@
                 <w:noProof/>
                 <w:webHidden/>
               </w:rPr>
-              <w:instrText xml:space="preserve"> PAGEREF _Toc243341614 \h </w:instrText>
+              <w:instrText xml:space="preserve"> PAGEREF _Toc243424298 \h </w:instrText>
             </w:r>
             <w:r>
               <w:rPr>
@@ -1686,7 +1685,6 @@
               <w:tab w:val="right" w:leader="dot" w:pos="8494"/>
             </w:tabs>
             <w:ind w:firstLine="0"/>
-            <w:jc w:val="left"/>
             <w:rPr>
               <w:rFonts w:asciiTheme="minorHAnsi" w:eastAsiaTheme="minorEastAsia" w:hAnsiTheme="minorHAnsi" w:cstheme="minorBidi"/>
               <w:noProof/>
@@ -1697,7 +1695,7 @@
               <w14:ligatures w14:val="standardContextual"/>
             </w:rPr>
           </w:pPr>
-          <w:hyperlink w:anchor="_Toc243341615" w:history="1">
+          <w:hyperlink w:anchor="_Toc243424299" w:history="1">
             <w:r>
               <w:rPr>
                 <w:rStyle w:val="Hyperlink"/>
@@ -1724,7 +1722,7 @@
                 <w:noProof/>
                 <w:webHidden/>
               </w:rPr>
-              <w:instrText xml:space="preserve"> PAGEREF _Toc243341615 \h </w:instrText>
+              <w:instrText xml:space="preserve"> PAGEREF _Toc243424299 \h </w:instrText>
             </w:r>
             <w:r>
               <w:rPr>
@@ -1760,8 +1758,9 @@
             <w:pStyle w:val="TOC2"/>
             <w:tabs>
               <w:tab w:val="clear" w:pos="1440"/>
-              <w:tab w:val="left" w:pos="1134"/>
+              <w:tab w:val="left" w:pos="851"/>
             </w:tabs>
+            <w:ind w:left="284"/>
             <w:rPr>
               <w:rFonts w:asciiTheme="minorHAnsi" w:eastAsiaTheme="minorEastAsia" w:hAnsiTheme="minorHAnsi" w:cstheme="minorBidi"/>
               <w:noProof/>
@@ -1772,7 +1771,7 @@
               <w14:ligatures w14:val="standardContextual"/>
             </w:rPr>
           </w:pPr>
-          <w:hyperlink w:anchor="_Toc243341616" w:history="1">
+          <w:hyperlink w:anchor="_Toc243424300" w:history="1">
             <w:r>
               <w:rPr>
                 <w:rStyle w:val="Hyperlink"/>
@@ -1818,7 +1817,7 @@
                 <w:noProof/>
                 <w:webHidden/>
               </w:rPr>
-              <w:instrText xml:space="preserve"> PAGEREF _Toc243341616 \h </w:instrText>
+              <w:instrText xml:space="preserve"> PAGEREF _Toc243424300 \h </w:instrText>
             </w:r>
             <w:r>
               <w:rPr>
@@ -1854,8 +1853,9 @@
             <w:pStyle w:val="TOC2"/>
             <w:tabs>
               <w:tab w:val="clear" w:pos="1440"/>
-              <w:tab w:val="left" w:pos="1134"/>
+              <w:tab w:val="left" w:pos="851"/>
             </w:tabs>
+            <w:ind w:left="284"/>
             <w:rPr>
               <w:rFonts w:asciiTheme="minorHAnsi" w:eastAsiaTheme="minorEastAsia" w:hAnsiTheme="minorHAnsi" w:cstheme="minorBidi"/>
               <w:noProof/>
@@ -1866,7 +1866,7 @@
               <w14:ligatures w14:val="standardContextual"/>
             </w:rPr>
           </w:pPr>
-          <w:hyperlink w:anchor="_Toc243341617" w:history="1">
+          <w:hyperlink w:anchor="_Toc243424301" w:history="1">
             <w:r>
               <w:rPr>
                 <w:rStyle w:val="Hyperlink"/>
@@ -1912,7 +1912,7 @@
                 <w:noProof/>
                 <w:webHidden/>
               </w:rPr>
-              <w:instrText xml:space="preserve"> PAGEREF _Toc243341617 \h </w:instrText>
+              <w:instrText xml:space="preserve"> PAGEREF _Toc243424301 \h </w:instrText>
             </w:r>
             <w:r>
               <w:rPr>
@@ -1948,8 +1948,9 @@
             <w:pStyle w:val="TOC2"/>
             <w:tabs>
               <w:tab w:val="clear" w:pos="1440"/>
-              <w:tab w:val="left" w:pos="1134"/>
+              <w:tab w:val="left" w:pos="851"/>
             </w:tabs>
+            <w:ind w:left="284"/>
             <w:rPr>
               <w:rFonts w:asciiTheme="minorHAnsi" w:eastAsiaTheme="minorEastAsia" w:hAnsiTheme="minorHAnsi" w:cstheme="minorBidi"/>
               <w:noProof/>
@@ -1960,7 +1961,7 @@
               <w14:ligatures w14:val="standardContextual"/>
             </w:rPr>
           </w:pPr>
-          <w:hyperlink w:anchor="_Toc243341618" w:history="1">
+          <w:hyperlink w:anchor="_Toc243424302" w:history="1">
             <w:r>
               <w:rPr>
                 <w:rStyle w:val="Hyperlink"/>
@@ -2006,7 +2007,7 @@
                 <w:noProof/>
                 <w:webHidden/>
               </w:rPr>
-              <w:instrText xml:space="preserve"> PAGEREF _Toc243341618 \h </w:instrText>
+              <w:instrText xml:space="preserve"> PAGEREF _Toc243424302 \h </w:instrText>
             </w:r>
             <w:r>
               <w:rPr>
@@ -2044,7 +2045,6 @@
               <w:tab w:val="right" w:leader="dot" w:pos="8494"/>
             </w:tabs>
             <w:ind w:firstLine="0"/>
-            <w:jc w:val="left"/>
             <w:rPr>
               <w:rFonts w:asciiTheme="minorHAnsi" w:eastAsiaTheme="minorEastAsia" w:hAnsiTheme="minorHAnsi" w:cstheme="minorBidi"/>
               <w:noProof/>
@@ -2055,7 +2055,7 @@
               <w14:ligatures w14:val="standardContextual"/>
             </w:rPr>
           </w:pPr>
-          <w:hyperlink w:anchor="_Toc243341619" w:history="1">
+          <w:hyperlink w:anchor="_Toc243424303" w:history="1">
             <w:r>
               <w:rPr>
                 <w:rStyle w:val="Hyperlink"/>
@@ -2082,7 +2082,7 @@
                 <w:noProof/>
                 <w:webHidden/>
               </w:rPr>
-              <w:instrText xml:space="preserve"> PAGEREF _Toc243341619 \h </w:instrText>
+              <w:instrText xml:space="preserve"> PAGEREF _Toc243424303 \h </w:instrText>
             </w:r>
             <w:r>
               <w:rPr>
@@ -2118,8 +2118,9 @@
             <w:pStyle w:val="TOC2"/>
             <w:tabs>
               <w:tab w:val="clear" w:pos="1440"/>
-              <w:tab w:val="left" w:pos="1134"/>
+              <w:tab w:val="left" w:pos="851"/>
             </w:tabs>
+            <w:ind w:left="284"/>
             <w:rPr>
               <w:rFonts w:asciiTheme="minorHAnsi" w:eastAsiaTheme="minorEastAsia" w:hAnsiTheme="minorHAnsi" w:cstheme="minorBidi"/>
               <w:noProof/>
@@ -2130,7 +2131,7 @@
               <w14:ligatures w14:val="standardContextual"/>
             </w:rPr>
           </w:pPr>
-          <w:hyperlink w:anchor="_Toc243341620" w:history="1">
+          <w:hyperlink w:anchor="_Toc243424304" w:history="1">
             <w:r>
               <w:rPr>
                 <w:rStyle w:val="Hyperlink"/>
@@ -2176,7 +2177,7 @@
                 <w:noProof/>
                 <w:webHidden/>
               </w:rPr>
-              <w:instrText xml:space="preserve"> PAGEREF _Toc243341620 \h </w:instrText>
+              <w:instrText xml:space="preserve"> PAGEREF _Toc243424304 \h </w:instrText>
             </w:r>
             <w:r>
               <w:rPr>
@@ -2212,8 +2213,9 @@
             <w:pStyle w:val="TOC2"/>
             <w:tabs>
               <w:tab w:val="clear" w:pos="1440"/>
-              <w:tab w:val="left" w:pos="1134"/>
+              <w:tab w:val="left" w:pos="851"/>
             </w:tabs>
+            <w:ind w:left="284"/>
             <w:rPr>
               <w:rFonts w:asciiTheme="minorHAnsi" w:eastAsiaTheme="minorEastAsia" w:hAnsiTheme="minorHAnsi" w:cstheme="minorBidi"/>
               <w:noProof/>
@@ -2224,7 +2226,7 @@
               <w14:ligatures w14:val="standardContextual"/>
             </w:rPr>
           </w:pPr>
-          <w:hyperlink w:anchor="_Toc243341621" w:history="1">
+          <w:hyperlink w:anchor="_Toc243424305" w:history="1">
             <w:r>
               <w:rPr>
                 <w:rStyle w:val="Hyperlink"/>
@@ -2270,7 +2272,7 @@
                 <w:noProof/>
                 <w:webHidden/>
               </w:rPr>
-              <w:instrText xml:space="preserve"> PAGEREF _Toc243341621 \h </w:instrText>
+              <w:instrText xml:space="preserve"> PAGEREF _Toc243424305 \h </w:instrText>
             </w:r>
             <w:r>
               <w:rPr>
@@ -2306,8 +2308,9 @@
             <w:pStyle w:val="TOC2"/>
             <w:tabs>
               <w:tab w:val="clear" w:pos="1440"/>
-              <w:tab w:val="left" w:pos="1134"/>
+              <w:tab w:val="left" w:pos="851"/>
             </w:tabs>
+            <w:ind w:left="284"/>
             <w:rPr>
               <w:rFonts w:asciiTheme="minorHAnsi" w:eastAsiaTheme="minorEastAsia" w:hAnsiTheme="minorHAnsi" w:cstheme="minorBidi"/>
               <w:noProof/>
@@ -2318,7 +2321,7 @@
               <w14:ligatures w14:val="standardContextual"/>
             </w:rPr>
           </w:pPr>
-          <w:hyperlink w:anchor="_Toc243341622" w:history="1">
+          <w:hyperlink w:anchor="_Toc243424306" w:history="1">
             <w:r>
               <w:rPr>
                 <w:rStyle w:val="Hyperlink"/>
@@ -2364,7 +2367,7 @@
                 <w:noProof/>
                 <w:webHidden/>
               </w:rPr>
-              <w:instrText xml:space="preserve"> PAGEREF _Toc243341622 \h </w:instrText>
+              <w:instrText xml:space="preserve"> PAGEREF _Toc243424306 \h </w:instrText>
             </w:r>
             <w:r>
               <w:rPr>
@@ -2400,8 +2403,9 @@
             <w:pStyle w:val="TOC2"/>
             <w:tabs>
               <w:tab w:val="clear" w:pos="1440"/>
-              <w:tab w:val="left" w:pos="1134"/>
+              <w:tab w:val="left" w:pos="851"/>
             </w:tabs>
+            <w:ind w:left="284"/>
             <w:rPr>
               <w:rFonts w:asciiTheme="minorHAnsi" w:eastAsiaTheme="minorEastAsia" w:hAnsiTheme="minorHAnsi" w:cstheme="minorBidi"/>
               <w:noProof/>
@@ -2412,7 +2416,7 @@
               <w14:ligatures w14:val="standardContextual"/>
             </w:rPr>
           </w:pPr>
-          <w:hyperlink w:anchor="_Toc243341623" w:history="1">
+          <w:hyperlink w:anchor="_Toc243424307" w:history="1">
             <w:r>
               <w:rPr>
                 <w:rStyle w:val="Hyperlink"/>
@@ -2458,7 +2462,7 @@
                 <w:noProof/>
                 <w:webHidden/>
               </w:rPr>
-              <w:instrText xml:space="preserve"> PAGEREF _Toc243341623 \h </w:instrText>
+              <w:instrText xml:space="preserve"> PAGEREF _Toc243424307 \h </w:instrText>
             </w:r>
             <w:r>
               <w:rPr>
@@ -2491,12 +2495,12 @@
         </w:p>
         <w:p>
           <w:pPr>
-            <w:pStyle w:val="TOC1"/>
+            <w:pStyle w:val="TOC2"/>
             <w:tabs>
-              <w:tab w:val="right" w:leader="dot" w:pos="8494"/>
+              <w:tab w:val="clear" w:pos="1440"/>
+              <w:tab w:val="left" w:pos="851"/>
             </w:tabs>
-            <w:ind w:firstLine="0"/>
-            <w:jc w:val="left"/>
+            <w:ind w:left="284"/>
             <w:rPr>
               <w:rFonts w:asciiTheme="minorHAnsi" w:eastAsiaTheme="minorEastAsia" w:hAnsiTheme="minorHAnsi" w:cstheme="minorBidi"/>
               <w:noProof/>
@@ -2507,13 +2511,32 @@
               <w14:ligatures w14:val="standardContextual"/>
             </w:rPr>
           </w:pPr>
-          <w:hyperlink w:anchor="_Toc243341624" w:history="1">
+          <w:hyperlink w:anchor="_Toc243424308" w:history="1">
             <w:r>
               <w:rPr>
                 <w:rStyle w:val="Hyperlink"/>
                 <w:noProof/>
               </w:rPr>
-              <w:t>Chapter 4: Security Architecture and Threat Modeling</w:t>
+              <w:t>3.5.</w:t>
+            </w:r>
+            <w:r>
+              <w:rPr>
+                <w:rFonts w:asciiTheme="minorHAnsi" w:eastAsiaTheme="minorEastAsia" w:hAnsiTheme="minorHAnsi" w:cstheme="minorBidi"/>
+                <w:noProof/>
+                <w:color w:val="auto"/>
+                <w:kern w:val="2"/>
+                <w:szCs w:val="24"/>
+                <w:lang w:val="en-ID" w:eastAsia="en-ID"/>
+                <w14:ligatures w14:val="standardContextual"/>
+              </w:rPr>
+              <w:tab/>
+            </w:r>
+            <w:r>
+              <w:rPr>
+                <w:rStyle w:val="Hyperlink"/>
+                <w:noProof/>
+              </w:rPr>
+              <w:t>LLM Intent Reader and Grounding Guards</w:t>
             </w:r>
             <w:r>
               <w:rPr>
@@ -2534,7 +2557,7 @@
                 <w:noProof/>
                 <w:webHidden/>
               </w:rPr>
-              <w:instrText xml:space="preserve"> PAGEREF _Toc243341624 \h </w:instrText>
+              <w:instrText xml:space="preserve"> PAGEREF _Toc243424308 \h </w:instrText>
             </w:r>
             <w:r>
               <w:rPr>
@@ -2554,7 +2577,7 @@
                 <w:noProof/>
                 <w:webHidden/>
               </w:rPr>
-              <w:t>11</w:t>
+              <w:t>10</w:t>
             </w:r>
             <w:r>
               <w:rPr>
@@ -2567,11 +2590,11 @@
         </w:p>
         <w:p>
           <w:pPr>
-            <w:pStyle w:val="TOC2"/>
+            <w:pStyle w:val="TOC1"/>
             <w:tabs>
-              <w:tab w:val="clear" w:pos="1440"/>
-              <w:tab w:val="left" w:pos="1134"/>
+              <w:tab w:val="right" w:leader="dot" w:pos="8494"/>
             </w:tabs>
+            <w:ind w:firstLine="0"/>
             <w:rPr>
               <w:rFonts w:asciiTheme="minorHAnsi" w:eastAsiaTheme="minorEastAsia" w:hAnsiTheme="minorHAnsi" w:cstheme="minorBidi"/>
               <w:noProof/>
@@ -2582,73 +2605,54 @@
               <w14:ligatures w14:val="standardContextual"/>
             </w:rPr>
           </w:pPr>
-          <w:hyperlink w:anchor="_Toc243341625" w:history="1">
+          <w:hyperlink w:anchor="_Toc243424309" w:history="1">
             <w:r>
               <w:rPr>
                 <w:rStyle w:val="Hyperlink"/>
                 <w:noProof/>
               </w:rPr>
-              <w:t>4.1.</w:t>
-            </w:r>
-            <w:r>
-              <w:rPr>
-                <w:rFonts w:asciiTheme="minorHAnsi" w:eastAsiaTheme="minorEastAsia" w:hAnsiTheme="minorHAnsi" w:cstheme="minorBidi"/>
-                <w:noProof/>
-                <w:color w:val="auto"/>
-                <w:kern w:val="2"/>
-                <w:szCs w:val="24"/>
-                <w:lang w:val="en-ID" w:eastAsia="en-ID"/>
-                <w14:ligatures w14:val="standardContextual"/>
+              <w:t>Chapter 4: Security Architecture and Threat Modeling</w:t>
+            </w:r>
+            <w:r>
+              <w:rPr>
+                <w:noProof/>
+                <w:webHidden/>
               </w:rPr>
               <w:tab/>
             </w:r>
             <w:r>
               <w:rPr>
-                <w:rStyle w:val="Hyperlink"/>
-                <w:noProof/>
-              </w:rPr>
-              <w:t>Threat Catalogue and Residual Risk</w:t>
-            </w:r>
-            <w:r>
-              <w:rPr>
                 <w:noProof/>
                 <w:webHidden/>
               </w:rPr>
-              <w:tab/>
+              <w:fldChar w:fldCharType="begin"/>
             </w:r>
             <w:r>
               <w:rPr>
                 <w:noProof/>
                 <w:webHidden/>
               </w:rPr>
-              <w:fldChar w:fldCharType="begin"/>
+              <w:instrText xml:space="preserve"> PAGEREF _Toc243424309 \h </w:instrText>
             </w:r>
             <w:r>
               <w:rPr>
                 <w:noProof/>
                 <w:webHidden/>
               </w:rPr>
-              <w:instrText xml:space="preserve"> PAGEREF _Toc243341625 \h </w:instrText>
             </w:r>
             <w:r>
               <w:rPr>
                 <w:noProof/>
                 <w:webHidden/>
               </w:rPr>
+              <w:fldChar w:fldCharType="separate"/>
             </w:r>
             <w:r>
               <w:rPr>
                 <w:noProof/>
                 <w:webHidden/>
               </w:rPr>
-              <w:fldChar w:fldCharType="separate"/>
-            </w:r>
-            <w:r>
-              <w:rPr>
-                <w:noProof/>
-                <w:webHidden/>
-              </w:rPr>
-              <w:t>11</w:t>
+              <w:t>12</w:t>
             </w:r>
             <w:r>
               <w:rPr>
@@ -2664,8 +2668,9 @@
             <w:pStyle w:val="TOC2"/>
             <w:tabs>
               <w:tab w:val="clear" w:pos="1440"/>
-              <w:tab w:val="left" w:pos="1134"/>
+              <w:tab w:val="left" w:pos="851"/>
             </w:tabs>
+            <w:ind w:left="284"/>
             <w:rPr>
               <w:rFonts w:asciiTheme="minorHAnsi" w:eastAsiaTheme="minorEastAsia" w:hAnsiTheme="minorHAnsi" w:cstheme="minorBidi"/>
               <w:noProof/>
@@ -2676,13 +2681,13 @@
               <w14:ligatures w14:val="standardContextual"/>
             </w:rPr>
           </w:pPr>
-          <w:hyperlink w:anchor="_Toc243341626" w:history="1">
+          <w:hyperlink w:anchor="_Toc243424310" w:history="1">
             <w:r>
               <w:rPr>
                 <w:rStyle w:val="Hyperlink"/>
                 <w:noProof/>
               </w:rPr>
-              <w:t>4.2.</w:t>
+              <w:t>4.1.</w:t>
             </w:r>
             <w:r>
               <w:rPr>
@@ -2701,7 +2706,7 @@
                 <w:rStyle w:val="Hyperlink"/>
                 <w:noProof/>
               </w:rPr>
-              <w:t>Key and Secret Management</w:t>
+              <w:t>Threat Catalogue and Residual Risk</w:t>
             </w:r>
             <w:r>
               <w:rPr>
@@ -2722,7 +2727,7 @@
                 <w:noProof/>
                 <w:webHidden/>
               </w:rPr>
-              <w:instrText xml:space="preserve"> PAGEREF _Toc243341626 \h </w:instrText>
+              <w:instrText xml:space="preserve"> PAGEREF _Toc243424310 \h </w:instrText>
             </w:r>
             <w:r>
               <w:rPr>
@@ -2742,7 +2747,7 @@
                 <w:noProof/>
                 <w:webHidden/>
               </w:rPr>
-              <w:t>11</w:t>
+              <w:t>12</w:t>
             </w:r>
             <w:r>
               <w:rPr>
@@ -2755,12 +2760,12 @@
         </w:p>
         <w:p>
           <w:pPr>
-            <w:pStyle w:val="TOC1"/>
+            <w:pStyle w:val="TOC2"/>
             <w:tabs>
-              <w:tab w:val="right" w:leader="dot" w:pos="8494"/>
+              <w:tab w:val="clear" w:pos="1440"/>
+              <w:tab w:val="left" w:pos="851"/>
             </w:tabs>
-            <w:ind w:firstLine="0"/>
-            <w:jc w:val="left"/>
+            <w:ind w:left="284"/>
             <w:rPr>
               <w:rFonts w:asciiTheme="minorHAnsi" w:eastAsiaTheme="minorEastAsia" w:hAnsiTheme="minorHAnsi" w:cstheme="minorBidi"/>
               <w:noProof/>
@@ -2771,13 +2776,32 @@
               <w14:ligatures w14:val="standardContextual"/>
             </w:rPr>
           </w:pPr>
-          <w:hyperlink w:anchor="_Toc243341627" w:history="1">
+          <w:hyperlink w:anchor="_Toc243424311" w:history="1">
             <w:r>
               <w:rPr>
                 <w:rStyle w:val="Hyperlink"/>
                 <w:noProof/>
               </w:rPr>
-              <w:t>Chapter 5: Implementation and Technology Stack</w:t>
+              <w:t>4.2.</w:t>
+            </w:r>
+            <w:r>
+              <w:rPr>
+                <w:rFonts w:asciiTheme="minorHAnsi" w:eastAsiaTheme="minorEastAsia" w:hAnsiTheme="minorHAnsi" w:cstheme="minorBidi"/>
+                <w:noProof/>
+                <w:color w:val="auto"/>
+                <w:kern w:val="2"/>
+                <w:szCs w:val="24"/>
+                <w:lang w:val="en-ID" w:eastAsia="en-ID"/>
+                <w14:ligatures w14:val="standardContextual"/>
+              </w:rPr>
+              <w:tab/>
+            </w:r>
+            <w:r>
+              <w:rPr>
+                <w:rStyle w:val="Hyperlink"/>
+                <w:noProof/>
+              </w:rPr>
+              <w:t>Key and Secret Management</w:t>
             </w:r>
             <w:r>
               <w:rPr>
@@ -2798,7 +2822,7 @@
                 <w:noProof/>
                 <w:webHidden/>
               </w:rPr>
-              <w:instrText xml:space="preserve"> PAGEREF _Toc243341627 \h </w:instrText>
+              <w:instrText xml:space="preserve"> PAGEREF _Toc243424311 \h </w:instrText>
             </w:r>
             <w:r>
               <w:rPr>
@@ -2831,11 +2855,11 @@
         </w:p>
         <w:p>
           <w:pPr>
-            <w:pStyle w:val="TOC2"/>
+            <w:pStyle w:val="TOC1"/>
             <w:tabs>
-              <w:tab w:val="clear" w:pos="1440"/>
-              <w:tab w:val="left" w:pos="1134"/>
+              <w:tab w:val="right" w:leader="dot" w:pos="8494"/>
             </w:tabs>
+            <w:ind w:firstLine="0"/>
             <w:rPr>
               <w:rFonts w:asciiTheme="minorHAnsi" w:eastAsiaTheme="minorEastAsia" w:hAnsiTheme="minorHAnsi" w:cstheme="minorBidi"/>
               <w:noProof/>
@@ -2846,73 +2870,54 @@
               <w14:ligatures w14:val="standardContextual"/>
             </w:rPr>
           </w:pPr>
-          <w:hyperlink w:anchor="_Toc243341628" w:history="1">
+          <w:hyperlink w:anchor="_Toc243424312" w:history="1">
             <w:r>
               <w:rPr>
                 <w:rStyle w:val="Hyperlink"/>
                 <w:noProof/>
               </w:rPr>
-              <w:t>5.1.</w:t>
-            </w:r>
-            <w:r>
-              <w:rPr>
-                <w:rFonts w:asciiTheme="minorHAnsi" w:eastAsiaTheme="minorEastAsia" w:hAnsiTheme="minorHAnsi" w:cstheme="minorBidi"/>
-                <w:noProof/>
-                <w:color w:val="auto"/>
-                <w:kern w:val="2"/>
-                <w:szCs w:val="24"/>
-                <w:lang w:val="en-ID" w:eastAsia="en-ID"/>
-                <w14:ligatures w14:val="standardContextual"/>
+              <w:t>Chapter 5: Implementation and Technology Stack</w:t>
+            </w:r>
+            <w:r>
+              <w:rPr>
+                <w:noProof/>
+                <w:webHidden/>
               </w:rPr>
               <w:tab/>
             </w:r>
             <w:r>
               <w:rPr>
-                <w:rStyle w:val="Hyperlink"/>
-                <w:noProof/>
-              </w:rPr>
-              <w:t>Runtime and Testing</w:t>
-            </w:r>
-            <w:r>
-              <w:rPr>
                 <w:noProof/>
                 <w:webHidden/>
               </w:rPr>
-              <w:tab/>
+              <w:fldChar w:fldCharType="begin"/>
             </w:r>
             <w:r>
               <w:rPr>
                 <w:noProof/>
                 <w:webHidden/>
               </w:rPr>
-              <w:fldChar w:fldCharType="begin"/>
+              <w:instrText xml:space="preserve"> PAGEREF _Toc243424312 \h </w:instrText>
             </w:r>
             <w:r>
               <w:rPr>
                 <w:noProof/>
                 <w:webHidden/>
               </w:rPr>
-              <w:instrText xml:space="preserve"> PAGEREF _Toc243341628 \h </w:instrText>
             </w:r>
             <w:r>
               <w:rPr>
                 <w:noProof/>
                 <w:webHidden/>
               </w:rPr>
+              <w:fldChar w:fldCharType="separate"/>
             </w:r>
             <w:r>
               <w:rPr>
                 <w:noProof/>
                 <w:webHidden/>
               </w:rPr>
-              <w:fldChar w:fldCharType="separate"/>
-            </w:r>
-            <w:r>
-              <w:rPr>
-                <w:noProof/>
-                <w:webHidden/>
-              </w:rPr>
-              <w:t>12</w:t>
+              <w:t>13</w:t>
             </w:r>
             <w:r>
               <w:rPr>
@@ -2928,8 +2933,9 @@
             <w:pStyle w:val="TOC2"/>
             <w:tabs>
               <w:tab w:val="clear" w:pos="1440"/>
-              <w:tab w:val="left" w:pos="1134"/>
+              <w:tab w:val="left" w:pos="851"/>
             </w:tabs>
+            <w:ind w:left="284"/>
             <w:rPr>
               <w:rFonts w:asciiTheme="minorHAnsi" w:eastAsiaTheme="minorEastAsia" w:hAnsiTheme="minorHAnsi" w:cstheme="minorBidi"/>
               <w:noProof/>
@@ -2940,13 +2946,13 @@
               <w14:ligatures w14:val="standardContextual"/>
             </w:rPr>
           </w:pPr>
-          <w:hyperlink w:anchor="_Toc243341629" w:history="1">
+          <w:hyperlink w:anchor="_Toc243424313" w:history="1">
             <w:r>
               <w:rPr>
                 <w:rStyle w:val="Hyperlink"/>
                 <w:noProof/>
               </w:rPr>
-              <w:t>5.2.</w:t>
+              <w:t>5.1.</w:t>
             </w:r>
             <w:r>
               <w:rPr>
@@ -2965,7 +2971,7 @@
                 <w:rStyle w:val="Hyperlink"/>
                 <w:noProof/>
               </w:rPr>
-              <w:t>Data Model and Repository Layout</w:t>
+              <w:t>Runtime and Testing</w:t>
             </w:r>
             <w:r>
               <w:rPr>
@@ -2986,7 +2992,7 @@
                 <w:noProof/>
                 <w:webHidden/>
               </w:rPr>
-              <w:instrText xml:space="preserve"> PAGEREF _Toc243341629 \h </w:instrText>
+              <w:instrText xml:space="preserve"> PAGEREF _Toc243424313 \h </w:instrText>
             </w:r>
             <w:r>
               <w:rPr>
@@ -3006,7 +3012,7 @@
                 <w:noProof/>
                 <w:webHidden/>
               </w:rPr>
-              <w:t>12</w:t>
+              <w:t>13</w:t>
             </w:r>
             <w:r>
               <w:rPr>
@@ -3019,12 +3025,12 @@
         </w:p>
         <w:p>
           <w:pPr>
-            <w:pStyle w:val="TOC1"/>
+            <w:pStyle w:val="TOC2"/>
             <w:tabs>
-              <w:tab w:val="right" w:leader="dot" w:pos="8494"/>
+              <w:tab w:val="clear" w:pos="1440"/>
+              <w:tab w:val="left" w:pos="851"/>
             </w:tabs>
-            <w:ind w:firstLine="0"/>
-            <w:jc w:val="left"/>
+            <w:ind w:left="284"/>
             <w:rPr>
               <w:rFonts w:asciiTheme="minorHAnsi" w:eastAsiaTheme="minorEastAsia" w:hAnsiTheme="minorHAnsi" w:cstheme="minorBidi"/>
               <w:noProof/>
@@ -3035,13 +3041,32 @@
               <w14:ligatures w14:val="standardContextual"/>
             </w:rPr>
           </w:pPr>
-          <w:hyperlink w:anchor="_Toc243341630" w:history="1">
+          <w:hyperlink w:anchor="_Toc243424314" w:history="1">
             <w:r>
               <w:rPr>
                 <w:rStyle w:val="Hyperlink"/>
                 <w:noProof/>
               </w:rPr>
-              <w:t>Chapter 6: Empirical Evaluation and Attack Benchmark</w:t>
+              <w:t>5.2.</w:t>
+            </w:r>
+            <w:r>
+              <w:rPr>
+                <w:rFonts w:asciiTheme="minorHAnsi" w:eastAsiaTheme="minorEastAsia" w:hAnsiTheme="minorHAnsi" w:cstheme="minorBidi"/>
+                <w:noProof/>
+                <w:color w:val="auto"/>
+                <w:kern w:val="2"/>
+                <w:szCs w:val="24"/>
+                <w:lang w:val="en-ID" w:eastAsia="en-ID"/>
+                <w14:ligatures w14:val="standardContextual"/>
+              </w:rPr>
+              <w:tab/>
+            </w:r>
+            <w:r>
+              <w:rPr>
+                <w:rStyle w:val="Hyperlink"/>
+                <w:noProof/>
+              </w:rPr>
+              <w:t>Data Model and Repository Layout</w:t>
             </w:r>
             <w:r>
               <w:rPr>
@@ -3062,7 +3087,7 @@
                 <w:noProof/>
                 <w:webHidden/>
               </w:rPr>
-              <w:instrText xml:space="preserve"> PAGEREF _Toc243341630 \h </w:instrText>
+              <w:instrText xml:space="preserve"> PAGEREF _Toc243424314 \h </w:instrText>
             </w:r>
             <w:r>
               <w:rPr>
@@ -3095,11 +3120,11 @@
         </w:p>
         <w:p>
           <w:pPr>
-            <w:pStyle w:val="TOC2"/>
+            <w:pStyle w:val="TOC1"/>
             <w:tabs>
-              <w:tab w:val="clear" w:pos="1440"/>
-              <w:tab w:val="left" w:pos="1134"/>
+              <w:tab w:val="right" w:leader="dot" w:pos="8494"/>
             </w:tabs>
+            <w:ind w:firstLine="0"/>
             <w:rPr>
               <w:rFonts w:asciiTheme="minorHAnsi" w:eastAsiaTheme="minorEastAsia" w:hAnsiTheme="minorHAnsi" w:cstheme="minorBidi"/>
               <w:noProof/>
@@ -3110,73 +3135,54 @@
               <w14:ligatures w14:val="standardContextual"/>
             </w:rPr>
           </w:pPr>
-          <w:hyperlink w:anchor="_Toc243341631" w:history="1">
+          <w:hyperlink w:anchor="_Toc243424315" w:history="1">
             <w:r>
               <w:rPr>
                 <w:rStyle w:val="Hyperlink"/>
                 <w:noProof/>
               </w:rPr>
-              <w:t>6.1.</w:t>
-            </w:r>
-            <w:r>
-              <w:rPr>
-                <w:rFonts w:asciiTheme="minorHAnsi" w:eastAsiaTheme="minorEastAsia" w:hAnsiTheme="minorHAnsi" w:cstheme="minorBidi"/>
-                <w:noProof/>
-                <w:color w:val="auto"/>
-                <w:kern w:val="2"/>
-                <w:szCs w:val="24"/>
-                <w:lang w:val="en-ID" w:eastAsia="en-ID"/>
-                <w14:ligatures w14:val="standardContextual"/>
+              <w:t>Chapter 6: Empirical Evaluation and Attack Benchmark</w:t>
+            </w:r>
+            <w:r>
+              <w:rPr>
+                <w:noProof/>
+                <w:webHidden/>
               </w:rPr>
               <w:tab/>
             </w:r>
             <w:r>
               <w:rPr>
-                <w:rStyle w:val="Hyperlink"/>
-                <w:noProof/>
-              </w:rPr>
-              <w:t>Acceptance Criteria (AC-01 to AC-10)</w:t>
-            </w:r>
-            <w:r>
-              <w:rPr>
                 <w:noProof/>
                 <w:webHidden/>
               </w:rPr>
-              <w:tab/>
+              <w:fldChar w:fldCharType="begin"/>
             </w:r>
             <w:r>
               <w:rPr>
                 <w:noProof/>
                 <w:webHidden/>
               </w:rPr>
-              <w:fldChar w:fldCharType="begin"/>
+              <w:instrText xml:space="preserve"> PAGEREF _Toc243424315 \h </w:instrText>
             </w:r>
             <w:r>
               <w:rPr>
                 <w:noProof/>
                 <w:webHidden/>
               </w:rPr>
-              <w:instrText xml:space="preserve"> PAGEREF _Toc243341631 \h </w:instrText>
             </w:r>
             <w:r>
               <w:rPr>
                 <w:noProof/>
                 <w:webHidden/>
               </w:rPr>
+              <w:fldChar w:fldCharType="separate"/>
             </w:r>
             <w:r>
               <w:rPr>
                 <w:noProof/>
                 <w:webHidden/>
               </w:rPr>
-              <w:fldChar w:fldCharType="separate"/>
-            </w:r>
-            <w:r>
-              <w:rPr>
-                <w:noProof/>
-                <w:webHidden/>
-              </w:rPr>
-              <w:t>13</w:t>
+              <w:t>14</w:t>
             </w:r>
             <w:r>
               <w:rPr>
@@ -3192,8 +3198,9 @@
             <w:pStyle w:val="TOC2"/>
             <w:tabs>
               <w:tab w:val="clear" w:pos="1440"/>
-              <w:tab w:val="left" w:pos="1134"/>
+              <w:tab w:val="left" w:pos="851"/>
             </w:tabs>
+            <w:ind w:left="284"/>
             <w:rPr>
               <w:rFonts w:asciiTheme="minorHAnsi" w:eastAsiaTheme="minorEastAsia" w:hAnsiTheme="minorHAnsi" w:cstheme="minorBidi"/>
               <w:noProof/>
@@ -3204,13 +3211,13 @@
               <w14:ligatures w14:val="standardContextual"/>
             </w:rPr>
           </w:pPr>
-          <w:hyperlink w:anchor="_Toc243341632" w:history="1">
+          <w:hyperlink w:anchor="_Toc243424316" w:history="1">
             <w:r>
               <w:rPr>
                 <w:rStyle w:val="Hyperlink"/>
                 <w:noProof/>
               </w:rPr>
-              <w:t>6.2.</w:t>
+              <w:t>6.1.</w:t>
             </w:r>
             <w:r>
               <w:rPr>
@@ -3229,7 +3236,7 @@
                 <w:rStyle w:val="Hyperlink"/>
                 <w:noProof/>
               </w:rPr>
-              <w:t>Attack Benchmark Results</w:t>
+              <w:t>Acceptance Criteria (AC-01 to AC-10)</w:t>
             </w:r>
             <w:r>
               <w:rPr>
@@ -3250,7 +3257,7 @@
                 <w:noProof/>
                 <w:webHidden/>
               </w:rPr>
-              <w:instrText xml:space="preserve"> PAGEREF _Toc243341632 \h </w:instrText>
+              <w:instrText xml:space="preserve"> PAGEREF _Toc243424316 \h </w:instrText>
             </w:r>
             <w:r>
               <w:rPr>
@@ -3270,7 +3277,7 @@
                 <w:noProof/>
                 <w:webHidden/>
               </w:rPr>
-              <w:t>13</w:t>
+              <w:t>14</w:t>
             </w:r>
             <w:r>
               <w:rPr>
@@ -3283,12 +3290,12 @@
         </w:p>
         <w:p>
           <w:pPr>
-            <w:pStyle w:val="TOC1"/>
+            <w:pStyle w:val="TOC2"/>
             <w:tabs>
-              <w:tab w:val="right" w:leader="dot" w:pos="8494"/>
+              <w:tab w:val="clear" w:pos="1440"/>
+              <w:tab w:val="left" w:pos="851"/>
             </w:tabs>
-            <w:ind w:firstLine="0"/>
-            <w:jc w:val="left"/>
+            <w:ind w:left="284"/>
             <w:rPr>
               <w:rFonts w:asciiTheme="minorHAnsi" w:eastAsiaTheme="minorEastAsia" w:hAnsiTheme="minorHAnsi" w:cstheme="minorBidi"/>
               <w:noProof/>
@@ -3299,13 +3306,32 @@
               <w14:ligatures w14:val="standardContextual"/>
             </w:rPr>
           </w:pPr>
-          <w:hyperlink w:anchor="_Toc243341633" w:history="1">
+          <w:hyperlink w:anchor="_Toc243424317" w:history="1">
             <w:r>
               <w:rPr>
                 <w:rStyle w:val="Hyperlink"/>
                 <w:noProof/>
               </w:rPr>
-              <w:t>Chapter 7: Limitations and Future Roadmap</w:t>
+              <w:t>6.2.</w:t>
+            </w:r>
+            <w:r>
+              <w:rPr>
+                <w:rFonts w:asciiTheme="minorHAnsi" w:eastAsiaTheme="minorEastAsia" w:hAnsiTheme="minorHAnsi" w:cstheme="minorBidi"/>
+                <w:noProof/>
+                <w:color w:val="auto"/>
+                <w:kern w:val="2"/>
+                <w:szCs w:val="24"/>
+                <w:lang w:val="en-ID" w:eastAsia="en-ID"/>
+                <w14:ligatures w14:val="standardContextual"/>
+              </w:rPr>
+              <w:tab/>
+            </w:r>
+            <w:r>
+              <w:rPr>
+                <w:rStyle w:val="Hyperlink"/>
+                <w:noProof/>
+              </w:rPr>
+              <w:t>Attack Benchmark Results</w:t>
             </w:r>
             <w:r>
               <w:rPr>
@@ -3326,7 +3352,7 @@
                 <w:noProof/>
                 <w:webHidden/>
               </w:rPr>
-              <w:instrText xml:space="preserve"> PAGEREF _Toc243341633 \h </w:instrText>
+              <w:instrText xml:space="preserve"> PAGEREF _Toc243424317 \h </w:instrText>
             </w:r>
             <w:r>
               <w:rPr>
@@ -3346,7 +3372,7 @@
                 <w:noProof/>
                 <w:webHidden/>
               </w:rPr>
-              <w:t>15</w:t>
+              <w:t>14</w:t>
             </w:r>
             <w:r>
               <w:rPr>
@@ -3359,11 +3385,11 @@
         </w:p>
         <w:p>
           <w:pPr>
-            <w:pStyle w:val="TOC2"/>
+            <w:pStyle w:val="TOC1"/>
             <w:tabs>
-              <w:tab w:val="clear" w:pos="1440"/>
-              <w:tab w:val="left" w:pos="1134"/>
+              <w:tab w:val="right" w:leader="dot" w:pos="8494"/>
             </w:tabs>
+            <w:ind w:firstLine="0"/>
             <w:rPr>
               <w:rFonts w:asciiTheme="minorHAnsi" w:eastAsiaTheme="minorEastAsia" w:hAnsiTheme="minorHAnsi" w:cstheme="minorBidi"/>
               <w:noProof/>
@@ -3374,73 +3400,54 @@
               <w14:ligatures w14:val="standardContextual"/>
             </w:rPr>
           </w:pPr>
-          <w:hyperlink w:anchor="_Toc243341634" w:history="1">
+          <w:hyperlink w:anchor="_Toc243424318" w:history="1">
             <w:r>
               <w:rPr>
                 <w:rStyle w:val="Hyperlink"/>
                 <w:noProof/>
               </w:rPr>
-              <w:t>7.1.</w:t>
-            </w:r>
-            <w:r>
-              <w:rPr>
-                <w:rFonts w:asciiTheme="minorHAnsi" w:eastAsiaTheme="minorEastAsia" w:hAnsiTheme="minorHAnsi" w:cstheme="minorBidi"/>
-                <w:noProof/>
-                <w:color w:val="auto"/>
-                <w:kern w:val="2"/>
-                <w:szCs w:val="24"/>
-                <w:lang w:val="en-ID" w:eastAsia="en-ID"/>
-                <w14:ligatures w14:val="standardContextual"/>
+              <w:t>Chapter 7: Limitations and Future Roadmap</w:t>
+            </w:r>
+            <w:r>
+              <w:rPr>
+                <w:noProof/>
+                <w:webHidden/>
               </w:rPr>
               <w:tab/>
             </w:r>
             <w:r>
               <w:rPr>
-                <w:rStyle w:val="Hyperlink"/>
-                <w:noProof/>
-              </w:rPr>
-              <w:t>Acknowledged Limitations</w:t>
-            </w:r>
-            <w:r>
-              <w:rPr>
                 <w:noProof/>
                 <w:webHidden/>
               </w:rPr>
-              <w:tab/>
+              <w:fldChar w:fldCharType="begin"/>
             </w:r>
             <w:r>
               <w:rPr>
                 <w:noProof/>
                 <w:webHidden/>
               </w:rPr>
-              <w:fldChar w:fldCharType="begin"/>
+              <w:instrText xml:space="preserve"> PAGEREF _Toc243424318 \h </w:instrText>
             </w:r>
             <w:r>
               <w:rPr>
                 <w:noProof/>
                 <w:webHidden/>
               </w:rPr>
-              <w:instrText xml:space="preserve"> PAGEREF _Toc243341634 \h </w:instrText>
             </w:r>
             <w:r>
               <w:rPr>
                 <w:noProof/>
                 <w:webHidden/>
               </w:rPr>
+              <w:fldChar w:fldCharType="separate"/>
             </w:r>
             <w:r>
               <w:rPr>
                 <w:noProof/>
                 <w:webHidden/>
               </w:rPr>
-              <w:fldChar w:fldCharType="separate"/>
-            </w:r>
-            <w:r>
-              <w:rPr>
-                <w:noProof/>
-                <w:webHidden/>
-              </w:rPr>
-              <w:t>15</w:t>
+              <w:t>16</w:t>
             </w:r>
             <w:r>
               <w:rPr>
@@ -3456,8 +3463,9 @@
             <w:pStyle w:val="TOC2"/>
             <w:tabs>
               <w:tab w:val="clear" w:pos="1440"/>
-              <w:tab w:val="left" w:pos="1134"/>
+              <w:tab w:val="left" w:pos="851"/>
             </w:tabs>
+            <w:ind w:left="284"/>
             <w:rPr>
               <w:rFonts w:asciiTheme="minorHAnsi" w:eastAsiaTheme="minorEastAsia" w:hAnsiTheme="minorHAnsi" w:cstheme="minorBidi"/>
               <w:noProof/>
@@ -3468,13 +3476,13 @@
               <w14:ligatures w14:val="standardContextual"/>
             </w:rPr>
           </w:pPr>
-          <w:hyperlink w:anchor="_Toc243341635" w:history="1">
+          <w:hyperlink w:anchor="_Toc243424319" w:history="1">
             <w:r>
               <w:rPr>
                 <w:rStyle w:val="Hyperlink"/>
                 <w:noProof/>
               </w:rPr>
-              <w:t>7.2.</w:t>
+              <w:t>7.1.</w:t>
             </w:r>
             <w:r>
               <w:rPr>
@@ -3493,7 +3501,7 @@
                 <w:rStyle w:val="Hyperlink"/>
                 <w:noProof/>
               </w:rPr>
-              <w:t>Engineering Roadmap</w:t>
+              <w:t>Acknowledged Limitations</w:t>
             </w:r>
             <w:r>
               <w:rPr>
@@ -3514,7 +3522,7 @@
                 <w:noProof/>
                 <w:webHidden/>
               </w:rPr>
-              <w:instrText xml:space="preserve"> PAGEREF _Toc243341635 \h </w:instrText>
+              <w:instrText xml:space="preserve"> PAGEREF _Toc243424319 \h </w:instrText>
             </w:r>
             <w:r>
               <w:rPr>
@@ -3534,7 +3542,7 @@
                 <w:noProof/>
                 <w:webHidden/>
               </w:rPr>
-              <w:t>15</w:t>
+              <w:t>16</w:t>
             </w:r>
             <w:r>
               <w:rPr>
@@ -3547,12 +3555,12 @@
         </w:p>
         <w:p>
           <w:pPr>
-            <w:pStyle w:val="TOC1"/>
+            <w:pStyle w:val="TOC2"/>
             <w:tabs>
-              <w:tab w:val="right" w:leader="dot" w:pos="8494"/>
+              <w:tab w:val="clear" w:pos="1440"/>
+              <w:tab w:val="left" w:pos="851"/>
             </w:tabs>
-            <w:ind w:firstLine="0"/>
-            <w:jc w:val="left"/>
+            <w:ind w:left="284"/>
             <w:rPr>
               <w:rFonts w:asciiTheme="minorHAnsi" w:eastAsiaTheme="minorEastAsia" w:hAnsiTheme="minorHAnsi" w:cstheme="minorBidi"/>
               <w:noProof/>
@@ -3563,13 +3571,32 @@
               <w14:ligatures w14:val="standardContextual"/>
             </w:rPr>
           </w:pPr>
-          <w:hyperlink w:anchor="_Toc243341636" w:history="1">
+          <w:hyperlink w:anchor="_Toc243424320" w:history="1">
             <w:r>
               <w:rPr>
                 <w:rStyle w:val="Hyperlink"/>
                 <w:noProof/>
               </w:rPr>
-              <w:t>Chapter 8: Conclusion</w:t>
+              <w:t>7.2.</w:t>
+            </w:r>
+            <w:r>
+              <w:rPr>
+                <w:rFonts w:asciiTheme="minorHAnsi" w:eastAsiaTheme="minorEastAsia" w:hAnsiTheme="minorHAnsi" w:cstheme="minorBidi"/>
+                <w:noProof/>
+                <w:color w:val="auto"/>
+                <w:kern w:val="2"/>
+                <w:szCs w:val="24"/>
+                <w:lang w:val="en-ID" w:eastAsia="en-ID"/>
+                <w14:ligatures w14:val="standardContextual"/>
+              </w:rPr>
+              <w:tab/>
+            </w:r>
+            <w:r>
+              <w:rPr>
+                <w:rStyle w:val="Hyperlink"/>
+                <w:noProof/>
+              </w:rPr>
+              <w:t>Engineering Roadmap</w:t>
             </w:r>
             <w:r>
               <w:rPr>
@@ -3590,7 +3617,7 @@
                 <w:noProof/>
                 <w:webHidden/>
               </w:rPr>
-              <w:instrText xml:space="preserve"> PAGEREF _Toc243341636 \h </w:instrText>
+              <w:instrText xml:space="preserve"> PAGEREF _Toc243424320 \h </w:instrText>
             </w:r>
             <w:r>
               <w:rPr>
@@ -3628,7 +3655,6 @@
               <w:tab w:val="right" w:leader="dot" w:pos="8494"/>
             </w:tabs>
             <w:ind w:firstLine="0"/>
-            <w:jc w:val="left"/>
             <w:rPr>
               <w:rFonts w:asciiTheme="minorHAnsi" w:eastAsiaTheme="minorEastAsia" w:hAnsiTheme="minorHAnsi" w:cstheme="minorBidi"/>
               <w:noProof/>
@@ -3639,13 +3665,13 @@
               <w14:ligatures w14:val="standardContextual"/>
             </w:rPr>
           </w:pPr>
-          <w:hyperlink w:anchor="_Toc243341637" w:history="1">
+          <w:hyperlink w:anchor="_Toc243424321" w:history="1">
             <w:r>
               <w:rPr>
                 <w:rStyle w:val="Hyperlink"/>
                 <w:noProof/>
               </w:rPr>
-              <w:t>Appendix A: Official Submission Checklist</w:t>
+              <w:t>Chapter 8: Conclusion</w:t>
             </w:r>
             <w:r>
               <w:rPr>
@@ -3666,7 +3692,7 @@
                 <w:noProof/>
                 <w:webHidden/>
               </w:rPr>
-              <w:instrText xml:space="preserve"> PAGEREF _Toc243341637 \h </w:instrText>
+              <w:instrText xml:space="preserve"> PAGEREF _Toc243424321 \h </w:instrText>
             </w:r>
             <w:r>
               <w:rPr>
@@ -3704,7 +3730,6 @@
               <w:tab w:val="right" w:leader="dot" w:pos="8494"/>
             </w:tabs>
             <w:ind w:firstLine="0"/>
-            <w:jc w:val="left"/>
             <w:rPr>
               <w:rFonts w:asciiTheme="minorHAnsi" w:eastAsiaTheme="minorEastAsia" w:hAnsiTheme="minorHAnsi" w:cstheme="minorBidi"/>
               <w:noProof/>
@@ -3715,13 +3740,13 @@
               <w14:ligatures w14:val="standardContextual"/>
             </w:rPr>
           </w:pPr>
-          <w:hyperlink w:anchor="_Toc243341638" w:history="1">
+          <w:hyperlink w:anchor="_Toc243424322" w:history="1">
             <w:r>
               <w:rPr>
                 <w:rStyle w:val="Hyperlink"/>
                 <w:noProof/>
               </w:rPr>
-              <w:t>Appendix B: Domain Glossary</w:t>
+              <w:t>Appendix A: Official Submission Checklist</w:t>
             </w:r>
             <w:r>
               <w:rPr>
@@ -3742,7 +3767,7 @@
                 <w:noProof/>
                 <w:webHidden/>
               </w:rPr>
-              <w:instrText xml:space="preserve"> PAGEREF _Toc243341638 \h </w:instrText>
+              <w:instrText xml:space="preserve"> PAGEREF _Toc243424322 \h </w:instrText>
             </w:r>
             <w:r>
               <w:rPr>
@@ -3762,7 +3787,7 @@
                 <w:noProof/>
                 <w:webHidden/>
               </w:rPr>
-              <w:t>17</w:t>
+              <w:t>18</w:t>
             </w:r>
             <w:r>
               <w:rPr>
@@ -3780,7 +3805,6 @@
               <w:tab w:val="right" w:leader="dot" w:pos="8494"/>
             </w:tabs>
             <w:ind w:firstLine="0"/>
-            <w:jc w:val="left"/>
             <w:rPr>
               <w:rFonts w:asciiTheme="minorHAnsi" w:eastAsiaTheme="minorEastAsia" w:hAnsiTheme="minorHAnsi" w:cstheme="minorBidi"/>
               <w:noProof/>
@@ -3791,12 +3815,87 @@
               <w14:ligatures w14:val="standardContextual"/>
             </w:rPr>
           </w:pPr>
-          <w:hyperlink w:anchor="_Toc243341639" w:history="1">
+          <w:hyperlink w:anchor="_Toc243424323" w:history="1">
             <w:r>
               <w:rPr>
                 <w:rStyle w:val="Hyperlink"/>
                 <w:noProof/>
               </w:rPr>
+              <w:t>Appendix B: Domain Glossary</w:t>
+            </w:r>
+            <w:r>
+              <w:rPr>
+                <w:noProof/>
+                <w:webHidden/>
+              </w:rPr>
+              <w:tab/>
+            </w:r>
+            <w:r>
+              <w:rPr>
+                <w:noProof/>
+                <w:webHidden/>
+              </w:rPr>
+              <w:fldChar w:fldCharType="begin"/>
+            </w:r>
+            <w:r>
+              <w:rPr>
+                <w:noProof/>
+                <w:webHidden/>
+              </w:rPr>
+              <w:instrText xml:space="preserve"> PAGEREF _Toc243424323 \h </w:instrText>
+            </w:r>
+            <w:r>
+              <w:rPr>
+                <w:noProof/>
+                <w:webHidden/>
+              </w:rPr>
+            </w:r>
+            <w:r>
+              <w:rPr>
+                <w:noProof/>
+                <w:webHidden/>
+              </w:rPr>
+              <w:fldChar w:fldCharType="separate"/>
+            </w:r>
+            <w:r>
+              <w:rPr>
+                <w:noProof/>
+                <w:webHidden/>
+              </w:rPr>
+              <w:t>18</w:t>
+            </w:r>
+            <w:r>
+              <w:rPr>
+                <w:noProof/>
+                <w:webHidden/>
+              </w:rPr>
+              <w:fldChar w:fldCharType="end"/>
+            </w:r>
+          </w:hyperlink>
+        </w:p>
+        <w:p>
+          <w:pPr>
+            <w:pStyle w:val="TOC1"/>
+            <w:tabs>
+              <w:tab w:val="right" w:leader="dot" w:pos="8494"/>
+            </w:tabs>
+            <w:ind w:firstLine="0"/>
+            <w:rPr>
+              <w:rFonts w:asciiTheme="minorHAnsi" w:eastAsiaTheme="minorEastAsia" w:hAnsiTheme="minorHAnsi" w:cstheme="minorBidi"/>
+              <w:noProof/>
+              <w:color w:val="auto"/>
+              <w:kern w:val="2"/>
+              <w:szCs w:val="24"/>
+              <w:lang w:val="en-ID" w:eastAsia="en-ID"/>
+              <w14:ligatures w14:val="standardContextual"/>
+            </w:rPr>
+          </w:pPr>
+          <w:hyperlink w:anchor="_Toc243424324" w:history="1">
+            <w:r>
+              <w:rPr>
+                <w:rStyle w:val="Hyperlink"/>
+                <w:noProof/>
+              </w:rPr>
               <w:t>Appendix C: Evidence Index</w:t>
             </w:r>
             <w:r>
@@ -3818,7 +3917,7 @@
                 <w:noProof/>
                 <w:webHidden/>
               </w:rPr>
-              <w:instrText xml:space="preserve"> PAGEREF _Toc243341639 \h </w:instrText>
+              <w:instrText xml:space="preserve"> PAGEREF _Toc243424324 \h </w:instrText>
             </w:r>
             <w:r>
               <w:rPr>
@@ -3838,7 +3937,7 @@
                 <w:noProof/>
                 <w:webHidden/>
               </w:rPr>
-              <w:t>17</w:t>
+              <w:t>18</w:t>
             </w:r>
             <w:r>
               <w:rPr>
@@ -3893,7 +3992,7 @@
       <w:pPr>
         <w:pStyle w:val="Heading1"/>
       </w:pPr>
-      <w:bookmarkStart w:id="3" w:name="_Toc243341610"/>
+      <w:bookmarkStart w:id="3" w:name="_Toc243424294"/>
       <w:r>
         <w:lastRenderedPageBreak/>
         <w:t>Chapter 1: Introduction</w:t>
@@ -3909,7 +4008,7 @@
         </w:numPr>
         <w:ind w:left="567" w:hanging="567"/>
       </w:pPr>
-      <w:bookmarkStart w:id="4" w:name="_Toc243341611"/>
+      <w:bookmarkStart w:id="4" w:name="_Toc243424295"/>
       <w:r>
         <w:t>The Real-World Problem: Remittance Overhead and Payment Diversion</w:t>
       </w:r>
@@ -3940,14 +4039,19 @@
         <w:rPr>
           <w:lang w:val="en-ID"/>
         </w:rPr>
-        <w:t>Beyond high fees, migrant families are frequent targets of payment-diversion fraud, clipboard address replacement, and phishing. On a public ledger, a mistaken or coerced transaction is irreversible, so protection has to be automated, not optional.</w:t>
+        <w:t xml:space="preserve">Beyond high fees, migrant families are frequent targets of payment-diversion fraud, clipboard address replacement, and phishing. On a public ledger, a mistaken or coerced transaction is </w:t>
       </w:r>
+      <w:r>
+        <w:t>irreversible, which makes automated protection a necessity.</w:t>
+      </w:r>
+      <w:proofErr w:type="gramStart"/>
       <w:r/>
       <w:r>
         <w:rPr>
           <w:lang w:val="en-ID"/>
         </w:rPr>
       </w:r>
+      <w:proofErr w:type="gramEnd"/>
     </w:p>
     <w:p>
       <w:pPr>
@@ -4017,7 +4121,7 @@
         </w:numPr>
         <w:ind w:left="567" w:hanging="567"/>
       </w:pPr>
-      <w:bookmarkStart w:id="5" w:name="_Toc243341612"/>
+      <w:bookmarkStart w:id="5" w:name="_Toc243424296"/>
       <w:r>
         <w:t>The Autonomous Dilemma: Convenience Versus Vulnerability</w:t>
       </w:r>
@@ -4046,7 +4150,7 @@
         </w:numPr>
         <w:ind w:left="567" w:hanging="567"/>
       </w:pPr>
-      <w:bookmarkStart w:id="6" w:name="_Toc243341613"/>
+      <w:bookmarkStart w:id="6" w:name="_Toc243424297"/>
       <w:r>
         <w:t>Project Objectives and Boundary Constraints</w:t>
       </w:r>
@@ -4102,7 +4206,6 @@
       </w:pPr>
       <w:proofErr w:type="spellStart"/>
       <w:r>
-        <w:lastRenderedPageBreak/>
         <w:t>Calldata</w:t>
       </w:r>
       <w:proofErr w:type="spellEnd"/>
@@ -4128,6 +4231,7 @@
         <w:ind w:left="567" w:hanging="567"/>
       </w:pPr>
       <w:r>
+        <w:lastRenderedPageBreak/>
         <w:t>Anomaly Neutralization: intercept look-alike addresses and obfuscated adversarial input.</w:t>
       </w:r>
     </w:p>
@@ -4140,7 +4244,7 @@
         </w:numPr>
         <w:ind w:left="567" w:hanging="567"/>
       </w:pPr>
-      <w:bookmarkStart w:id="7" w:name="_Toc243341614"/>
+      <w:bookmarkStart w:id="7" w:name="_Toc243424298"/>
       <w:r>
         <w:t>Positioning: Before vs. After</w:t>
       </w:r>
@@ -4665,7 +4769,7 @@
       <w:pPr>
         <w:pStyle w:val="Heading1"/>
       </w:pPr>
-      <w:bookmarkStart w:id="8" w:name="_Toc243341615"/>
+      <w:bookmarkStart w:id="8" w:name="_Toc243424299"/>
       <w:r>
         <w:lastRenderedPageBreak/>
         <w:t>Chapter 2: System Architecture and Data Flow</w:t>
@@ -4681,7 +4785,7 @@
         </w:numPr>
         <w:ind w:left="567" w:hanging="567"/>
       </w:pPr>
-      <w:bookmarkStart w:id="9" w:name="_Toc243341616"/>
+      <w:bookmarkStart w:id="9" w:name="_Toc243424300"/>
       <w:r>
         <w:t>End-to-End Topology</w:t>
       </w:r>
@@ -4799,7 +4903,7 @@
         </w:numPr>
         <w:ind w:left="567" w:hanging="567"/>
       </w:pPr>
-      <w:bookmarkStart w:id="10" w:name="_Toc243341617"/>
+      <w:bookmarkStart w:id="10" w:name="_Toc243424301"/>
       <w:r>
         <w:t>Modular Component Taxonomy</w:t>
       </w:r>
@@ -5471,6 +5575,73 @@
           </w:p>
         </w:tc>
       </w:tr>
+      <w:tr>
+        <w:trPr>
+          <w:cantSplit/>
+          <w:jc w:val="center"/>
+        </w:trPr>
+        <w:tc>
+          <w:tcPr>
+            <w:tcW w:w="1724" w:type="dxa"/>
+          </w:tcPr>
+          <w:p>
+            <w:pPr>
+              <w:pStyle w:val="TTable"/>
+              <w:ind w:firstLine="0"/>
+            </w:pPr>
+            <w:r>
+              <w:t>Question Rule</w:t>
+            </w:r>
+          </w:p>
+        </w:tc>
+        <w:tc>
+          <w:tcPr>
+            <w:tcW w:w="2011" w:type="dxa"/>
+          </w:tcPr>
+          <w:p>
+            <w:pPr>
+              <w:pStyle w:val="TTable"/>
+              <w:ind w:firstLine="0"/>
+            </w:pPr>
+            <w:r>
+              <w:t>policy/</w:t>
+            </w:r>
+            <w:proofErr w:type="spellStart"/>
+            <w:r>
+              <w:t>question.ts</w:t>
+            </w:r>
+            <w:proofErr w:type="spellEnd"/>
+          </w:p>
+        </w:tc>
+        <w:tc>
+          <w:tcPr>
+            <w:tcW w:w="3160" w:type="dxa"/>
+          </w:tcPr>
+          <w:p>
+            <w:pPr>
+              <w:pStyle w:val="TTable"/>
+              <w:ind w:firstLine="0"/>
+            </w:pPr>
+            <w:r>
+              <w:t>Treats a question as a question, never as a silent transfer; never cancels an attack</w:t>
+            </w:r>
+          </w:p>
+        </w:tc>
+        <w:tc>
+          <w:tcPr>
+            <w:tcW w:w="1609" w:type="dxa"/>
+          </w:tcPr>
+          <w:p>
+            <w:pPr>
+              <w:pStyle w:val="TTable"/>
+              <w:ind w:firstLine="0"/>
+            </w:pPr>
+            <w:r>
+              <w:t>Deterministic</w:t>
+            </w:r>
+          </w:p>
+        </w:tc>
+      </w:tr>
     </w:tbl>
     <w:p>
       <w:pPr>
@@ -5481,7 +5652,7 @@
         </w:numPr>
         <w:ind w:left="567" w:hanging="567"/>
       </w:pPr>
-      <w:bookmarkStart w:id="11" w:name="_Toc243341618"/>
+      <w:bookmarkStart w:id="11" w:name="_Toc243424302"/>
       <w:r>
         <w:t>Transaction Lifecycle and Two-Stage Policy Evaluation</w:t>
       </w:r>
@@ -5523,7 +5694,7 @@
       <w:pPr>
         <w:pStyle w:val="Heading1"/>
       </w:pPr>
-      <w:bookmarkStart w:id="12" w:name="_Toc243341619"/>
+      <w:bookmarkStart w:id="12" w:name="_Toc243424303"/>
       <w:r>
         <w:lastRenderedPageBreak/>
         <w:t>Chapter 3: Core Security Algorithms</w:t>
@@ -5539,7 +5710,7 @@
         </w:numPr>
         <w:ind w:left="567" w:hanging="567"/>
       </w:pPr>
-      <w:bookmarkStart w:id="13" w:name="_Toc243341620"/>
+      <w:bookmarkStart w:id="13" w:name="_Toc243424304"/>
       <w:r>
         <w:t>Intent Parsing and the Amount-as-null Convention</w:t>
       </w:r>
@@ -5847,7 +6018,7 @@
         </w:numPr>
         <w:ind w:left="567" w:hanging="567"/>
       </w:pPr>
-      <w:bookmarkStart w:id="14" w:name="_Toc243341621"/>
+      <w:bookmarkStart w:id="14" w:name="_Toc243424305"/>
       <w:r>
         <w:t>Deterministic Policy Engine (</w:t>
       </w:r>
@@ -6519,7 +6690,7 @@
         </w:numPr>
         <w:ind w:left="567" w:hanging="567"/>
       </w:pPr>
-      <w:bookmarkStart w:id="15" w:name="_Toc243341622"/>
+      <w:bookmarkStart w:id="15" w:name="_Toc243424306"/>
       <w:r>
         <w:lastRenderedPageBreak/>
         <w:t>Look-alike and Injection Detection</w:t>
@@ -6602,7 +6773,7 @@
         </w:numPr>
         <w:ind w:left="567" w:hanging="567"/>
       </w:pPr>
-      <w:bookmarkStart w:id="16" w:name="_Toc243341623"/>
+      <w:bookmarkStart w:id="16" w:name="_Toc243424307"/>
       <w:proofErr w:type="spellStart"/>
       <w:r>
         <w:t>Calldata</w:t>
@@ -6626,17 +6797,319 @@
       </w:r>
       <w:proofErr w:type="spellEnd"/>
       <w:r>
-        <w:t xml:space="preserve"> that will actually be broadcast is decoded and compared against the card the user confirmed. If the recipient, token, or amount differs, the transfer is rejected as an intent mismatch. This catches</w:t>
+        <w:t xml:space="preserve"> that will actually be broadcast is decoded and compared against the card the user confirmed. If the recipient, token, or amount differs, the transfer is rejected as an intent mismatch. </w:t>
       </w:r>
-      <w:proofErr w:type="gramStart"/>
-      <w:r/>
-      <w:proofErr w:type="gramEnd"/>
       <w:r>
-        <w:t xml:space="preserve"> a recipient swapped in at the last moment</w:t>
+        <w:t>This catches a recipient swapped in at the last moment</w:t>
       </w:r>
       <w:r>
         <w:t>.</w:t>
       </w:r>
+    </w:p>
+    <w:p>
+      <w:pPr>
+        <w:pStyle w:val="Heading2"/>
+        <w:numPr>
+          <w:ilvl w:val="0"/>
+          <w:numId w:val="13"/>
+        </w:numPr>
+        <w:ind w:left="567" w:hanging="567"/>
+      </w:pPr>
+      <w:bookmarkStart w:id="17" w:name="_Toc243424308"/>
+      <w:r>
+        <w:t>LLM Intent Reader and Grounding Guards</w:t>
+      </w:r>
+      <w:bookmarkEnd w:id="17"/>
+    </w:p>
+    <w:p>
+      <w:pPr>
+        <w:ind w:firstLine="567"/>
+        <w:rPr>
+          <w:lang w:val="en-ID"/>
+        </w:rPr>
+      </w:pPr>
+      <w:r>
+        <w:rPr>
+          <w:lang w:val="en-ID"/>
+        </w:rPr>
+        <w:t>The intent reader in agent/</w:t>
+      </w:r>
+      <w:proofErr w:type="spellStart"/>
+      <w:r>
+        <w:rPr>
+          <w:lang w:val="en-ID"/>
+        </w:rPr>
+        <w:t>parseIntent.ts</w:t>
+      </w:r>
+      <w:proofErr w:type="spellEnd"/>
+      <w:r>
+        <w:rPr>
+          <w:lang w:val="en-ID"/>
+        </w:rPr>
+        <w:t xml:space="preserve"> works in a fixed order. First, </w:t>
+      </w:r>
+      <w:proofErr w:type="spellStart"/>
+      <w:proofErr w:type="gramStart"/>
+      <w:r>
+        <w:rPr>
+          <w:lang w:val="en-ID"/>
+        </w:rPr>
+        <w:t>detectInjection</w:t>
+      </w:r>
+      <w:proofErr w:type="spellEnd"/>
+      <w:r>
+        <w:rPr>
+          <w:lang w:val="en-ID"/>
+        </w:rPr>
+        <w:t>(</w:t>
+      </w:r>
+      <w:proofErr w:type="gramEnd"/>
+      <w:r>
+        <w:rPr>
+          <w:lang w:val="en-ID"/>
+        </w:rPr>
+        <w:t>) and the provenance check run on every message; attack text and forwarded orders stop here and never reach the model, so the outcome of an attack does not depend on the model or its gateway being available. Second, the deterministic rule reader parses the sentence and reports when it is unsure. Third, only the sentences the rules could not read are sent to the LLM through tool calling, within a 2.5-second budget (LLM_TIMEOUT_MS). The model can only choose one of four tools (</w:t>
+      </w:r>
+      <w:proofErr w:type="spellStart"/>
+      <w:r>
+        <w:rPr>
+          <w:lang w:val="en-ID"/>
+        </w:rPr>
+        <w:t>request_transfer</w:t>
+      </w:r>
+      <w:proofErr w:type="spellEnd"/>
+      <w:r>
+        <w:rPr>
+          <w:lang w:val="en-ID"/>
+        </w:rPr>
+        <w:t xml:space="preserve">, </w:t>
+      </w:r>
+      <w:proofErr w:type="spellStart"/>
+      <w:r>
+        <w:rPr>
+          <w:lang w:val="en-ID"/>
+        </w:rPr>
+        <w:t>create_mandate</w:t>
+      </w:r>
+      <w:proofErr w:type="spellEnd"/>
+      <w:r>
+        <w:rPr>
+          <w:lang w:val="en-ID"/>
+        </w:rPr>
+        <w:t xml:space="preserve">, </w:t>
+      </w:r>
+      <w:proofErr w:type="spellStart"/>
+      <w:r>
+        <w:rPr>
+          <w:lang w:val="en-ID"/>
+        </w:rPr>
+        <w:t>explain_blocked</w:t>
+      </w:r>
+      <w:proofErr w:type="spellEnd"/>
+      <w:r>
+        <w:rPr>
+          <w:lang w:val="en-ID"/>
+        </w:rPr>
+        <w:t xml:space="preserve">, </w:t>
+      </w:r>
+      <w:proofErr w:type="spellStart"/>
+      <w:r>
+        <w:rPr>
+          <w:lang w:val="en-ID"/>
+        </w:rPr>
+        <w:t>ask_help</w:t>
+      </w:r>
+      <w:proofErr w:type="spellEnd"/>
+      <w:r>
+        <w:rPr>
+          <w:lang w:val="en-ID"/>
+        </w:rPr>
+        <w:t>) and fill in the amount, address and recipient name; the prompt contains no limits or allowlists, because those live only in policy/</w:t>
+      </w:r>
+      <w:proofErr w:type="spellStart"/>
+      <w:r>
+        <w:rPr>
+          <w:lang w:val="en-ID"/>
+        </w:rPr>
+        <w:t>checkPolicy.ts</w:t>
+      </w:r>
+      <w:proofErr w:type="spellEnd"/>
+      <w:r>
+        <w:rPr>
+          <w:lang w:val="en-ID"/>
+        </w:rPr>
+        <w:t>.</w:t>
+      </w:r>
+    </w:p>
+    <w:p>
+      <w:pPr>
+        <w:ind w:firstLine="567"/>
+        <w:rPr>
+          <w:lang w:val="en-ID"/>
+        </w:rPr>
+      </w:pPr>
+      <w:r>
+        <w:rPr>
+          <w:lang w:val="en-ID"/>
+        </w:rPr>
+        <w:t>Three guards run after the reader on every path, so a wrong or jailbroken model cannot become a wrong transfer:</w:t>
+      </w:r>
+    </w:p>
+    <w:p>
+      <w:pPr>
+        <w:numPr>
+          <w:ilvl w:val="0"/>
+          <w:numId w:val="20"/>
+        </w:numPr>
+        <w:tabs>
+          <w:tab w:val="clear" w:pos="720"/>
+          <w:tab w:val="num" w:pos="567"/>
+        </w:tabs>
+        <w:ind w:left="567" w:hanging="567"/>
+        <w:rPr>
+          <w:lang w:val="en-ID"/>
+        </w:rPr>
+      </w:pPr>
+      <w:r>
+        <w:rPr>
+          <w:lang w:val="en-ID"/>
+        </w:rPr>
+        <w:t xml:space="preserve">Amount grounding: an amount is kept only if the owner actually wrote that number; </w:t>
+      </w:r>
+      <w:proofErr w:type="gramStart"/>
+      <w:r>
+        <w:rPr>
+          <w:lang w:val="en-ID"/>
+        </w:rPr>
+        <w:t>otherwise</w:t>
+      </w:r>
+      <w:proofErr w:type="gramEnd"/>
+      <w:r>
+        <w:rPr>
+          <w:lang w:val="en-ID"/>
+        </w:rPr>
+        <w:t xml:space="preserve"> it becomes null and the owner is asked to clarify.</w:t>
+      </w:r>
+    </w:p>
+    <w:p>
+      <w:pPr>
+        <w:numPr>
+          <w:ilvl w:val="0"/>
+          <w:numId w:val="20"/>
+        </w:numPr>
+        <w:tabs>
+          <w:tab w:val="clear" w:pos="720"/>
+          <w:tab w:val="num" w:pos="567"/>
+        </w:tabs>
+        <w:ind w:left="567" w:hanging="567"/>
+        <w:rPr>
+          <w:lang w:val="en-ID"/>
+        </w:rPr>
+      </w:pPr>
+      <w:r>
+        <w:rPr>
+          <w:lang w:val="en-ID"/>
+        </w:rPr>
+        <w:t xml:space="preserve">Address grounding: an address the owner did not type is dropped; a </w:t>
+      </w:r>
+      <w:proofErr w:type="spellStart"/>
+      <w:r>
+        <w:rPr>
+          <w:lang w:val="en-ID"/>
+        </w:rPr>
+        <w:t>confusably</w:t>
+      </w:r>
+      <w:proofErr w:type="spellEnd"/>
+      <w:r>
+        <w:rPr>
+          <w:lang w:val="en-ID"/>
+        </w:rPr>
+        <w:t xml:space="preserve"> typed one (letter O for zero) is normalised and flagged as a look-alike.</w:t>
+      </w:r>
+    </w:p>
+    <w:p>
+      <w:pPr>
+        <w:numPr>
+          <w:ilvl w:val="0"/>
+          <w:numId w:val="20"/>
+        </w:numPr>
+        <w:tabs>
+          <w:tab w:val="clear" w:pos="720"/>
+          <w:tab w:val="num" w:pos="567"/>
+        </w:tabs>
+        <w:ind w:left="567" w:hanging="567"/>
+        <w:rPr>
+          <w:lang w:val="en-ID"/>
+        </w:rPr>
+      </w:pPr>
+      <w:r>
+        <w:rPr>
+          <w:lang w:val="en-ID"/>
+        </w:rPr>
+        <w:lastRenderedPageBreak/>
+        <w:t>Injection and provenance: an injection or forwarded order is forced onto the transfer path so the denial is logged, never silently answered.</w:t>
+      </w:r>
+    </w:p>
+    <w:p>
+      <w:pPr>
+        <w:ind w:firstLine="567"/>
+        <w:rPr>
+          <w:lang w:val="en-ID"/>
+        </w:rPr>
+      </w:pPr>
+      <w:r>
+        <w:rPr>
+          <w:lang w:val="en-ID"/>
+        </w:rPr>
+        <w:t>If no API key is set, LLM_DISABLED=1, or the model call fails or times out, the server falls back to the rule reader, and every reply records which reader answered (</w:t>
+      </w:r>
+      <w:proofErr w:type="spellStart"/>
+      <w:r>
+        <w:rPr>
+          <w:lang w:val="en-ID"/>
+        </w:rPr>
+        <w:t>llm</w:t>
+      </w:r>
+      <w:proofErr w:type="spellEnd"/>
+      <w:r>
+        <w:rPr>
+          <w:lang w:val="en-ID"/>
+        </w:rPr>
+        <w:t>, rules or cache). A separate rule, policy/</w:t>
+      </w:r>
+      <w:proofErr w:type="spellStart"/>
+      <w:r>
+        <w:rPr>
+          <w:lang w:val="en-ID"/>
+        </w:rPr>
+        <w:t>question.ts</w:t>
+      </w:r>
+      <w:proofErr w:type="spellEnd"/>
+      <w:r>
+        <w:rPr>
+          <w:lang w:val="en-ID"/>
+        </w:rPr>
+        <w:t>, treats a question ("Can you send 10 USDC to Adik?") as a question, not an order, so it never becomes a silent transfer; a question never cancels an attack, which is denied first. Auto-send drafts are built from the owner's own sentence (agent/</w:t>
+      </w:r>
+      <w:proofErr w:type="spellStart"/>
+      <w:r>
+        <w:rPr>
+          <w:lang w:val="en-ID"/>
+        </w:rPr>
+        <w:t>mandate.ts</w:t>
+      </w:r>
+      <w:proofErr w:type="spellEnd"/>
+      <w:r>
+        <w:rPr>
+          <w:lang w:val="en-ID"/>
+        </w:rPr>
+        <w:t>) and their numbers are never invented.</w:t>
+      </w:r>
+    </w:p>
+    <w:p>
+      <w:pPr>
+        <w:ind w:firstLine="0"/>
+      </w:pPr>
     </w:p>
     <w:p>
       <w:pPr>
@@ -6658,12 +7131,12 @@
       <w:pPr>
         <w:pStyle w:val="Heading1"/>
       </w:pPr>
-      <w:bookmarkStart w:id="17" w:name="_Toc243341624"/>
+      <w:bookmarkStart w:id="18" w:name="_Toc243424309"/>
       <w:r>
         <w:lastRenderedPageBreak/>
         <w:t>Chapter 4: Security Architecture and Threat Modeling</w:t>
       </w:r>
-      <w:bookmarkEnd w:id="17"/>
+      <w:bookmarkEnd w:id="18"/>
     </w:p>
     <w:p>
       <w:pPr>
@@ -6674,11 +7147,11 @@
         </w:numPr>
         <w:ind w:left="567" w:hanging="567"/>
       </w:pPr>
-      <w:bookmarkStart w:id="18" w:name="_Toc243341625"/>
+      <w:bookmarkStart w:id="19" w:name="_Toc243424310"/>
       <w:r>
         <w:t>Threat Catalogue and Residual Risk</w:t>
       </w:r>
-      <w:bookmarkEnd w:id="18"/>
+      <w:bookmarkEnd w:id="19"/>
     </w:p>
     <w:p>
       <w:pPr>
@@ -7315,11 +7788,11 @@
         </w:numPr>
         <w:ind w:left="567" w:hanging="567"/>
       </w:pPr>
-      <w:bookmarkStart w:id="19" w:name="_Toc243341626"/>
+      <w:bookmarkStart w:id="20" w:name="_Toc243424311"/>
       <w:r>
         <w:t>Key and Secret Management</w:t>
       </w:r>
-      <w:bookmarkEnd w:id="19"/>
+      <w:bookmarkEnd w:id="20"/>
     </w:p>
     <w:p>
       <w:pPr>
@@ -7383,12 +7856,12 @@
       <w:pPr>
         <w:pStyle w:val="Heading1"/>
       </w:pPr>
-      <w:bookmarkStart w:id="20" w:name="_Toc243341627"/>
+      <w:bookmarkStart w:id="21" w:name="_Toc243424312"/>
       <w:r>
         <w:lastRenderedPageBreak/>
         <w:t>Chapter 5: Implementation and Technology Stack</w:t>
       </w:r>
-      <w:bookmarkEnd w:id="20"/>
+      <w:bookmarkEnd w:id="21"/>
     </w:p>
     <w:p>
       <w:pPr>
@@ -7399,11 +7872,11 @@
         </w:numPr>
         <w:ind w:left="567" w:hanging="567"/>
       </w:pPr>
-      <w:bookmarkStart w:id="21" w:name="_Toc243341628"/>
+      <w:bookmarkStart w:id="22" w:name="_Toc243424313"/>
       <w:r>
         <w:t>Runtime and Testing</w:t>
       </w:r>
-      <w:bookmarkEnd w:id="21"/>
+      <w:bookmarkEnd w:id="22"/>
     </w:p>
     <w:p>
       <w:pPr>
@@ -7430,11 +7903,11 @@
         </w:numPr>
         <w:ind w:left="567" w:hanging="567"/>
       </w:pPr>
-      <w:bookmarkStart w:id="22" w:name="_Toc243341629"/>
+      <w:bookmarkStart w:id="23" w:name="_Toc243424314"/>
       <w:r>
         <w:t>Data Model and Repository Layout</w:t>
       </w:r>
-      <w:bookmarkEnd w:id="22"/>
+      <w:bookmarkEnd w:id="23"/>
     </w:p>
     <w:p>
       <w:pPr>
@@ -7576,12 +8049,12 @@
       <w:pPr>
         <w:pStyle w:val="Heading1"/>
       </w:pPr>
-      <w:bookmarkStart w:id="23" w:name="_Toc243341630"/>
+      <w:bookmarkStart w:id="24" w:name="_Toc243424315"/>
       <w:r>
         <w:lastRenderedPageBreak/>
         <w:t>Chapter 6: Empirical Evaluation and Attack Benchmark</w:t>
       </w:r>
-      <w:bookmarkEnd w:id="23"/>
+      <w:bookmarkEnd w:id="24"/>
     </w:p>
     <w:p>
       <w:pPr>
@@ -7592,11 +8065,11 @@
         </w:numPr>
         <w:ind w:left="567" w:hanging="567"/>
       </w:pPr>
-      <w:bookmarkStart w:id="24" w:name="_Toc243341631"/>
+      <w:bookmarkStart w:id="25" w:name="_Toc243424316"/>
       <w:r>
         <w:t>Acceptance Criteria (AC-01 to AC-10)</w:t>
       </w:r>
-      <w:bookmarkEnd w:id="24"/>
+      <w:bookmarkEnd w:id="25"/>
     </w:p>
     <w:p>
       <w:pPr>
@@ -7847,7 +8320,6 @@
               <w:ind w:firstLine="0"/>
             </w:pPr>
             <w:r>
-              <w:rPr/>
               <w:t>AC-03</w:t>
             </w:r>
           </w:p>
@@ -7862,7 +8334,6 @@
               <w:ind w:firstLine="0"/>
             </w:pPr>
             <w:r>
-              <w:rPr/>
               <w:t>Confirm threshold</w:t>
             </w:r>
           </w:p>
@@ -7877,7 +8348,6 @@
               <w:ind w:firstLine="0"/>
             </w:pPr>
             <w:r>
-              <w:rPr/>
               <w:t>Transfer above threshold requires PIN or biometric</w:t>
             </w:r>
           </w:p>
@@ -7892,7 +8362,6 @@
               <w:ind w:firstLine="0"/>
             </w:pPr>
             <w:r>
-              <w:rPr/>
               <w:t>Verified on-chain</w:t>
             </w:r>
           </w:p>
@@ -8350,11 +8819,11 @@
         </w:numPr>
         <w:ind w:left="567" w:hanging="567"/>
       </w:pPr>
-      <w:bookmarkStart w:id="25" w:name="_Toc243341632"/>
+      <w:bookmarkStart w:id="26" w:name="_Toc243424317"/>
       <w:r>
         <w:t>Attack Benchmark Results</w:t>
       </w:r>
-      <w:bookmarkEnd w:id="25"/>
+      <w:bookmarkEnd w:id="26"/>
     </w:p>
     <w:p>
       <w:pPr>
@@ -8469,7 +8938,6 @@
             <w:r>
               <w:t>120</w:t>
             </w:r>
-            <w:r/>
           </w:p>
         </w:tc>
       </w:tr>
@@ -8666,12 +9134,12 @@
       <w:pPr>
         <w:pStyle w:val="Heading1"/>
       </w:pPr>
-      <w:bookmarkStart w:id="26" w:name="_Toc243341633"/>
+      <w:bookmarkStart w:id="27" w:name="_Toc243424318"/>
       <w:r>
         <w:lastRenderedPageBreak/>
         <w:t>Chapter 7: Limitations and Future Roadmap</w:t>
       </w:r>
-      <w:bookmarkEnd w:id="26"/>
+      <w:bookmarkEnd w:id="27"/>
     </w:p>
     <w:p>
       <w:pPr>
@@ -8682,11 +9150,11 @@
         </w:numPr>
         <w:ind w:left="567" w:hanging="567"/>
       </w:pPr>
-      <w:bookmarkStart w:id="27" w:name="_Toc243341634"/>
+      <w:bookmarkStart w:id="28" w:name="_Toc243424319"/>
       <w:r>
         <w:t>Acknowledged Limitations</w:t>
       </w:r>
-      <w:bookmarkEnd w:id="27"/>
+      <w:bookmarkEnd w:id="28"/>
     </w:p>
     <w:p>
       <w:pPr>
@@ -8709,19 +9177,7 @@
         <w:ind w:left="567" w:hanging="567"/>
       </w:pPr>
       <w:r>
-        <w:t>The LLM only reads what the rules cannot: agent/parseIntent.ts reads with rules first and asks the LLM through tool calling only when unsure; with no API key it falls back to the rules, and the attack benchmark is reported with the rule reader</w:t>
-      </w:r>
-      <w:proofErr w:type="spellStart"/>
-      <w:r/>
-      <w:proofErr w:type="spellEnd"/>
-      <w:r/>
-      <w:proofErr w:type="spellStart"/>
-      <w:r>
-        <w:rPr/>
-      </w:r>
-      <w:proofErr w:type="spellEnd"/>
-      <w:r>
-        <w:rPr/>
+        <w:t>The LLM only reads what the rules cannot: attacks and forwarded text never reach the model, the rule reader handles every sentence it can read, and the LLM is asked only when the rules are unsure; with no model key the server still runs on the rules, and the policy gate is identical on either path.</w:t>
       </w:r>
     </w:p>
     <w:p>
@@ -8744,6 +9200,9 @@
       <w:r>
         <w:t xml:space="preserve"> is a heuristic, not a guarantee; the policy engine stands behind it as the final layer</w:t>
       </w:r>
+      <w:r>
+        <w:t>.</w:t>
+      </w:r>
     </w:p>
     <w:p>
       <w:pPr>
@@ -8755,8 +9214,9 @@
         <w:ind w:left="567" w:hanging="567"/>
       </w:pPr>
       <w:r>
-        <w:t>Demo credentials: Default PIN and device credentials are documented demo defaults (123456 / demo-device) kept so reviewers can reproduce results on testnet; they are rotated before any production release</w:t>
+        <w:t>Demo credentials: Default PIN and device credentials are documented demo defaults (123456 / demo-device) kept so reviewers can reproduce results on testnet; they are rotated before any production release.</w:t>
       </w:r>
+      <w:r/>
     </w:p>
     <w:p>
       <w:pPr>
@@ -8766,13 +9226,9 @@
           <w:numId w:val="18"/>
         </w:numPr>
         <w:ind w:left="567" w:hanging="567"/>
-        <w:rPr>
-          <w:highlight w:val="yellow"/>
-        </w:rPr>
       </w:pPr>
       <w:r>
-        <w:rPr/>
-        <w:t>Server has no public URL: The server is not deployed publicly; it runs locally or behind a tunnel for the demo, and reviewers can reproduce every result locally with npm run server and npm test</w:t>
+        <w:t>Server has no permanent public URL: it is reachable through a secure tunnel for the demo; a live public endpoint is still future work.</w:t>
       </w:r>
     </w:p>
     <w:p>
@@ -8784,20 +9240,22 @@
         </w:numPr>
         <w:ind w:left="567" w:hanging="567"/>
       </w:pPr>
-      <w:bookmarkStart w:id="28" w:name="_Toc243341635"/>
+      <w:bookmarkStart w:id="29" w:name="_Toc243424320"/>
       <w:r>
         <w:t>Engineering Roadmap</w:t>
       </w:r>
-      <w:bookmarkEnd w:id="28"/>
+      <w:bookmarkEnd w:id="29"/>
     </w:p>
     <w:p>
       <w:pPr>
         <w:ind w:firstLine="567"/>
       </w:pPr>
       <w:r>
-        <w:t>Planned work, in order: rerun the attack benchmark with the LLM reader enabled and widen its coverage; add ERC-4337 smart accounts with ERC-7715 session keys to move policy enforcement on-chain; rotate the demo credentials before any production release; and publish a public server endpoint.</w:t>
+        <w:t>Planned work, in order: add ERC-4337 smart accounts with ERC-7715 session keys to move policy enforcement on-chain; rotate demo credentials; and publish a public server endpoint</w:t>
       </w:r>
-      <w:r/>
+      <w:r>
+        <w:t>.</w:t>
+      </w:r>
     </w:p>
     <w:p>
       <w:pPr>
@@ -8819,12 +9277,12 @@
       <w:pPr>
         <w:pStyle w:val="Heading1"/>
       </w:pPr>
-      <w:bookmarkStart w:id="29" w:name="_Toc243341636"/>
+      <w:bookmarkStart w:id="30" w:name="_Toc243424321"/>
       <w:r>
         <w:lastRenderedPageBreak/>
         <w:t>Chapter 8: Conclusion</w:t>
       </w:r>
-      <w:bookmarkEnd w:id="29"/>
+      <w:bookmarkEnd w:id="30"/>
     </w:p>
     <w:p>
       <w:pPr>
@@ -8851,7 +9309,6 @@
           <w:szCs w:val="28"/>
         </w:rPr>
       </w:pPr>
-      <w:bookmarkStart w:id="30" w:name="_Toc243341637"/>
       <w:r>
         <w:br w:type="page"/>
       </w:r>
@@ -8860,11 +9317,12 @@
       <w:pPr>
         <w:pStyle w:val="Heading1"/>
       </w:pPr>
+      <w:bookmarkStart w:id="31" w:name="_Toc243424322"/>
       <w:r>
         <w:lastRenderedPageBreak/>
         <w:t>Appendix A: Official Submission Checklist</w:t>
       </w:r>
-      <w:bookmarkEnd w:id="30"/>
+      <w:bookmarkEnd w:id="31"/>
     </w:p>
     <w:p>
       <w:pPr>
@@ -9041,7 +9499,6 @@
               <w:ind w:firstLine="0"/>
             </w:pPr>
             <w:r>
-              <w:rPr/>
               <w:t>Complete</w:t>
             </w:r>
           </w:p>
@@ -9234,7 +9691,6 @@
               <w:ind w:firstLine="0"/>
             </w:pPr>
             <w:r>
-              <w:rPr/>
               <w:t>Link in submission email</w:t>
             </w:r>
           </w:p>
@@ -9245,11 +9701,11 @@
       <w:pPr>
         <w:pStyle w:val="Heading1"/>
       </w:pPr>
-      <w:bookmarkStart w:id="31" w:name="_Toc243341638"/>
+      <w:bookmarkStart w:id="32" w:name="_Toc243424323"/>
       <w:r>
         <w:t>Appendix B: Domain Glossary</w:t>
       </w:r>
-      <w:bookmarkEnd w:id="31"/>
+      <w:bookmarkEnd w:id="32"/>
     </w:p>
     <w:p>
       <w:pPr>
@@ -9538,11 +9994,11 @@
       <w:pPr>
         <w:pStyle w:val="Heading1"/>
       </w:pPr>
-      <w:bookmarkStart w:id="32" w:name="_Toc243341639"/>
+      <w:bookmarkStart w:id="33" w:name="_Toc243424324"/>
       <w:r>
         <w:t>Appendix C: Evidence Index</w:t>
       </w:r>
-      <w:bookmarkEnd w:id="32"/>
+      <w:bookmarkEnd w:id="33"/>
     </w:p>
     <w:p>
       <w:pPr>
@@ -9713,10 +10169,11 @@
               <w:ind w:firstLine="0"/>
             </w:pPr>
             <w:r>
-              <w:t>120 checks</w:t>
-            </w:r>
-            <w:r/>
-            <w:r/>
+              <w:t>120</w:t>
+            </w:r>
+            <w:r>
+              <w:t xml:space="preserve"> checks</w:t>
+            </w:r>
           </w:p>
         </w:tc>
         <w:tc>
@@ -10194,7 +10651,7 @@
   <w:abstractNum w:abstractNumId="10" w15:restartNumberingAfterBreak="0">
     <w:nsid w:val="062455A6"/>
     <w:multiLevelType w:val="hybridMultilevel"/>
-    <w:tmpl w:val="3A50754A"/>
+    <w:tmpl w:val="2AAED7C6"/>
     <w:lvl w:ilvl="0" w:tplc="99944D1E">
       <w:start w:val="1"/>
       <w:numFmt w:val="decimal"/>
@@ -10281,6 +10738,95 @@
     </w:lvl>
   </w:abstractNum>
   <w:abstractNum w:abstractNumId="11" w15:restartNumberingAfterBreak="0">
+    <w:nsid w:val="0B695A9C"/>
+    <w:multiLevelType w:val="hybridMultilevel"/>
+    <w:tmpl w:val="A6126B24"/>
+    <w:lvl w:ilvl="0" w:tplc="D5FCD034">
+      <w:start w:val="1"/>
+      <w:numFmt w:val="decimal"/>
+      <w:lvlText w:val="3.%1."/>
+      <w:lvlJc w:val="left"/>
+      <w:pPr>
+        <w:ind w:left="720" w:hanging="360"/>
+      </w:pPr>
+      <w:rPr>
+        <w:rFonts w:hint="default"/>
+      </w:rPr>
+    </w:lvl>
+    <w:lvl w:ilvl="1" w:tplc="38090019" w:tentative="1">
+      <w:start w:val="1"/>
+      <w:numFmt w:val="lowerLetter"/>
+      <w:lvlText w:val="%2."/>
+      <w:lvlJc w:val="left"/>
+      <w:pPr>
+        <w:ind w:left="1440" w:hanging="360"/>
+      </w:pPr>
+    </w:lvl>
+    <w:lvl w:ilvl="2" w:tplc="3809001B" w:tentative="1">
+      <w:start w:val="1"/>
+      <w:numFmt w:val="lowerRoman"/>
+      <w:lvlText w:val="%3."/>
+      <w:lvlJc w:val="right"/>
+      <w:pPr>
+        <w:ind w:left="2160" w:hanging="180"/>
+      </w:pPr>
+    </w:lvl>
+    <w:lvl w:ilvl="3" w:tplc="3809000F" w:tentative="1">
+      <w:start w:val="1"/>
+      <w:numFmt w:val="decimal"/>
+      <w:lvlText w:val="%4."/>
+      <w:lvlJc w:val="left"/>
+      <w:pPr>
+        <w:ind w:left="2880" w:hanging="360"/>
+      </w:pPr>
+    </w:lvl>
+    <w:lvl w:ilvl="4" w:tplc="38090019" w:tentative="1">
+      <w:start w:val="1"/>
+      <w:numFmt w:val="lowerLetter"/>
+      <w:lvlText w:val="%5."/>
+      <w:lvlJc w:val="left"/>
+      <w:pPr>
+        <w:ind w:left="3600" w:hanging="360"/>
+      </w:pPr>
+    </w:lvl>
+    <w:lvl w:ilvl="5" w:tplc="3809001B" w:tentative="1">
+      <w:start w:val="1"/>
+      <w:numFmt w:val="lowerRoman"/>
+      <w:lvlText w:val="%6."/>
+      <w:lvlJc w:val="right"/>
+      <w:pPr>
+        <w:ind w:left="4320" w:hanging="180"/>
+      </w:pPr>
+    </w:lvl>
+    <w:lvl w:ilvl="6" w:tplc="3809000F" w:tentative="1">
+      <w:start w:val="1"/>
+      <w:numFmt w:val="decimal"/>
+      <w:lvlText w:val="%7."/>
+      <w:lvlJc w:val="left"/>
+      <w:pPr>
+        <w:ind w:left="5040" w:hanging="360"/>
+      </w:pPr>
+    </w:lvl>
+    <w:lvl w:ilvl="7" w:tplc="38090019" w:tentative="1">
+      <w:start w:val="1"/>
+      <w:numFmt w:val="lowerLetter"/>
+      <w:lvlText w:val="%8."/>
+      <w:lvlJc w:val="left"/>
+      <w:pPr>
+        <w:ind w:left="5760" w:hanging="360"/>
+      </w:pPr>
+    </w:lvl>
+    <w:lvl w:ilvl="8" w:tplc="3809001B" w:tentative="1">
+      <w:start w:val="1"/>
+      <w:numFmt w:val="lowerRoman"/>
+      <w:lvlText w:val="%9."/>
+      <w:lvlJc w:val="right"/>
+      <w:pPr>
+        <w:ind w:left="6480" w:hanging="180"/>
+      </w:pPr>
+    </w:lvl>
+  </w:abstractNum>
+  <w:abstractNum w:abstractNumId="12" w15:restartNumberingAfterBreak="0">
     <w:nsid w:val="1234048B"/>
     <w:multiLevelType w:val="hybridMultilevel"/>
     <w:tmpl w:val="0986DA20"/>
@@ -10366,7 +10912,7 @@
       </w:pPr>
     </w:lvl>
   </w:abstractNum>
-  <w:abstractNum w:abstractNumId="12" w15:restartNumberingAfterBreak="0">
+  <w:abstractNum w:abstractNumId="13" w15:restartNumberingAfterBreak="0">
     <w:nsid w:val="1453755D"/>
     <w:multiLevelType w:val="hybridMultilevel"/>
     <w:tmpl w:val="8012B018"/>
@@ -10455,7 +11001,7 @@
       </w:pPr>
     </w:lvl>
   </w:abstractNum>
-  <w:abstractNum w:abstractNumId="13" w15:restartNumberingAfterBreak="0">
+  <w:abstractNum w:abstractNumId="14" w15:restartNumberingAfterBreak="0">
     <w:nsid w:val="1D824AA3"/>
     <w:multiLevelType w:val="hybridMultilevel"/>
     <w:tmpl w:val="122EDB64"/>
@@ -10544,7 +11090,7 @@
       </w:pPr>
     </w:lvl>
   </w:abstractNum>
-  <w:abstractNum w:abstractNumId="14" w15:restartNumberingAfterBreak="0">
+  <w:abstractNum w:abstractNumId="15" w15:restartNumberingAfterBreak="0">
     <w:nsid w:val="2AEB300C"/>
     <w:multiLevelType w:val="hybridMultilevel"/>
     <w:tmpl w:val="D48C9A90"/>
@@ -10633,7 +11179,7 @@
       </w:pPr>
     </w:lvl>
   </w:abstractNum>
-  <w:abstractNum w:abstractNumId="15" w15:restartNumberingAfterBreak="0">
+  <w:abstractNum w:abstractNumId="16" w15:restartNumberingAfterBreak="0">
     <w:nsid w:val="40F47F55"/>
     <w:multiLevelType w:val="hybridMultilevel"/>
     <w:tmpl w:val="14E4C9FE"/>
@@ -10722,7 +11268,156 @@
       </w:pPr>
     </w:lvl>
   </w:abstractNum>
-  <w:abstractNum w:abstractNumId="16" w15:restartNumberingAfterBreak="0">
+  <w:abstractNum w:abstractNumId="17" w15:restartNumberingAfterBreak="0">
+    <w:nsid w:val="5A3E5499"/>
+    <w:multiLevelType w:val="multilevel"/>
+    <w:tmpl w:val="58AE760C"/>
+    <w:lvl w:ilvl="0">
+      <w:start w:val="1"/>
+      <w:numFmt w:val="bullet"/>
+      <w:lvlText w:val=""/>
+      <w:lvlJc w:val="left"/>
+      <w:pPr>
+        <w:tabs>
+          <w:tab w:val="num" w:pos="720"/>
+        </w:tabs>
+        <w:ind w:left="720" w:hanging="360"/>
+      </w:pPr>
+      <w:rPr>
+        <w:rFonts w:ascii="Symbol" w:hAnsi="Symbol" w:hint="default"/>
+        <w:sz w:val="20"/>
+      </w:rPr>
+    </w:lvl>
+    <w:lvl w:ilvl="1" w:tentative="1">
+      <w:start w:val="1"/>
+      <w:numFmt w:val="bullet"/>
+      <w:lvlText w:val=""/>
+      <w:lvlJc w:val="left"/>
+      <w:pPr>
+        <w:tabs>
+          <w:tab w:val="num" w:pos="1440"/>
+        </w:tabs>
+        <w:ind w:left="1440" w:hanging="360"/>
+      </w:pPr>
+      <w:rPr>
+        <w:rFonts w:ascii="Symbol" w:hAnsi="Symbol" w:hint="default"/>
+        <w:sz w:val="20"/>
+      </w:rPr>
+    </w:lvl>
+    <w:lvl w:ilvl="2" w:tentative="1">
+      <w:start w:val="1"/>
+      <w:numFmt w:val="bullet"/>
+      <w:lvlText w:val=""/>
+      <w:lvlJc w:val="left"/>
+      <w:pPr>
+        <w:tabs>
+          <w:tab w:val="num" w:pos="2160"/>
+        </w:tabs>
+        <w:ind w:left="2160" w:hanging="360"/>
+      </w:pPr>
+      <w:rPr>
+        <w:rFonts w:ascii="Symbol" w:hAnsi="Symbol" w:hint="default"/>
+        <w:sz w:val="20"/>
+      </w:rPr>
+    </w:lvl>
+    <w:lvl w:ilvl="3" w:tentative="1">
+      <w:start w:val="1"/>
+      <w:numFmt w:val="bullet"/>
+      <w:lvlText w:val=""/>
+      <w:lvlJc w:val="left"/>
+      <w:pPr>
+        <w:tabs>
+          <w:tab w:val="num" w:pos="2880"/>
+        </w:tabs>
+        <w:ind w:left="2880" w:hanging="360"/>
+      </w:pPr>
+      <w:rPr>
+        <w:rFonts w:ascii="Symbol" w:hAnsi="Symbol" w:hint="default"/>
+        <w:sz w:val="20"/>
+      </w:rPr>
+    </w:lvl>
+    <w:lvl w:ilvl="4" w:tentative="1">
+      <w:start w:val="1"/>
+      <w:numFmt w:val="bullet"/>
+      <w:lvlText w:val=""/>
+      <w:lvlJc w:val="left"/>
+      <w:pPr>
+        <w:tabs>
+          <w:tab w:val="num" w:pos="3600"/>
+        </w:tabs>
+        <w:ind w:left="3600" w:hanging="360"/>
+      </w:pPr>
+      <w:rPr>
+        <w:rFonts w:ascii="Symbol" w:hAnsi="Symbol" w:hint="default"/>
+        <w:sz w:val="20"/>
+      </w:rPr>
+    </w:lvl>
+    <w:lvl w:ilvl="5" w:tentative="1">
+      <w:start w:val="1"/>
+      <w:numFmt w:val="bullet"/>
+      <w:lvlText w:val=""/>
+      <w:lvlJc w:val="left"/>
+      <w:pPr>
+        <w:tabs>
+          <w:tab w:val="num" w:pos="4320"/>
+        </w:tabs>
+        <w:ind w:left="4320" w:hanging="360"/>
+      </w:pPr>
+      <w:rPr>
+        <w:rFonts w:ascii="Symbol" w:hAnsi="Symbol" w:hint="default"/>
+        <w:sz w:val="20"/>
+      </w:rPr>
+    </w:lvl>
+    <w:lvl w:ilvl="6" w:tentative="1">
+      <w:start w:val="1"/>
+      <w:numFmt w:val="bullet"/>
+      <w:lvlText w:val=""/>
+      <w:lvlJc w:val="left"/>
+      <w:pPr>
+        <w:tabs>
+          <w:tab w:val="num" w:pos="5040"/>
+        </w:tabs>
+        <w:ind w:left="5040" w:hanging="360"/>
+      </w:pPr>
+      <w:rPr>
+        <w:rFonts w:ascii="Symbol" w:hAnsi="Symbol" w:hint="default"/>
+        <w:sz w:val="20"/>
+      </w:rPr>
+    </w:lvl>
+    <w:lvl w:ilvl="7" w:tentative="1">
+      <w:start w:val="1"/>
+      <w:numFmt w:val="bullet"/>
+      <w:lvlText w:val=""/>
+      <w:lvlJc w:val="left"/>
+      <w:pPr>
+        <w:tabs>
+          <w:tab w:val="num" w:pos="5760"/>
+        </w:tabs>
+        <w:ind w:left="5760" w:hanging="360"/>
+      </w:pPr>
+      <w:rPr>
+        <w:rFonts w:ascii="Symbol" w:hAnsi="Symbol" w:hint="default"/>
+        <w:sz w:val="20"/>
+      </w:rPr>
+    </w:lvl>
+    <w:lvl w:ilvl="8" w:tentative="1">
+      <w:start w:val="1"/>
+      <w:numFmt w:val="bullet"/>
+      <w:lvlText w:val=""/>
+      <w:lvlJc w:val="left"/>
+      <w:pPr>
+        <w:tabs>
+          <w:tab w:val="num" w:pos="6480"/>
+        </w:tabs>
+        <w:ind w:left="6480" w:hanging="360"/>
+      </w:pPr>
+      <w:rPr>
+        <w:rFonts w:ascii="Symbol" w:hAnsi="Symbol" w:hint="default"/>
+        <w:sz w:val="20"/>
+      </w:rPr>
+    </w:lvl>
+  </w:abstractNum>
+  <w:abstractNum w:abstractNumId="18" w15:restartNumberingAfterBreak="0">
     <w:nsid w:val="6C4A230B"/>
     <w:multiLevelType w:val="hybridMultilevel"/>
     <w:tmpl w:val="20ACC3F6"/>
@@ -10808,7 +11503,7 @@
       </w:pPr>
     </w:lvl>
   </w:abstractNum>
-  <w:abstractNum w:abstractNumId="17" w15:restartNumberingAfterBreak="0">
+  <w:abstractNum w:abstractNumId="19" w15:restartNumberingAfterBreak="0">
     <w:nsid w:val="746A4A43"/>
     <w:multiLevelType w:val="hybridMultilevel"/>
     <w:tmpl w:val="39141D98"/>
@@ -10925,31 +11620,37 @@
     <w:abstractNumId w:val="0"/>
   </w:num>
   <w:num w:numId="10" w16cid:durableId="913852016">
-    <w:abstractNumId w:val="16"/>
+    <w:abstractNumId w:val="18"/>
   </w:num>
   <w:num w:numId="11" w16cid:durableId="1225681987">
     <w:abstractNumId w:val="9"/>
   </w:num>
   <w:num w:numId="12" w16cid:durableId="1284657792">
-    <w:abstractNumId w:val="15"/>
+    <w:abstractNumId w:val="16"/>
   </w:num>
   <w:num w:numId="13" w16cid:durableId="1838812794">
     <w:abstractNumId w:val="10"/>
   </w:num>
   <w:num w:numId="14" w16cid:durableId="1355419438">
+    <w:abstractNumId w:val="14"/>
+  </w:num>
+  <w:num w:numId="15" w16cid:durableId="423652329">
+    <w:abstractNumId w:val="15"/>
+  </w:num>
+  <w:num w:numId="16" w16cid:durableId="1494446231">
     <w:abstractNumId w:val="13"/>
   </w:num>
-  <w:num w:numId="15" w16cid:durableId="423652329">
-    <w:abstractNumId w:val="14"/>
+  <w:num w:numId="17" w16cid:durableId="447627197">
+    <w:abstractNumId w:val="19"/>
   </w:num>
-  <w:num w:numId="16" w16cid:durableId="1494446231">
+  <w:num w:numId="18" w16cid:durableId="395207866">
     <w:abstractNumId w:val="12"/>
   </w:num>
-  <w:num w:numId="17" w16cid:durableId="447627197">
+  <w:num w:numId="19" w16cid:durableId="1853565447">
+    <w:abstractNumId w:val="11"/>
+  </w:num>
+  <w:num w:numId="20" w16cid:durableId="473914112">
     <w:abstractNumId w:val="17"/>
-  </w:num>
-  <w:num w:numId="18" w16cid:durableId="395207866">
-    <w:abstractNumId w:val="11"/>
   </w:num>
 </w:numbering>
 </file>
@@ -22856,6 +23557,10 @@
 </file>
 
 <file path=customXml/item1.xml><?xml version="1.0" encoding="utf-8"?>
+<b:Sources xmlns:b="http://schemas.openxmlformats.org/officeDocument/2006/bibliography" xmlns="http://schemas.openxmlformats.org/officeDocument/2006/bibliography" SelectedStyle="/APA.XSL" StyleName="APA"/>
+</file>
+
+<file path=customXml/item2.xml><?xml version="1.0" encoding="utf-8"?>
 <p:properties xmlns:p="http://schemas.microsoft.com/office/2006/metadata/properties" xmlns:xsi="http://www.w3.org/2001/XMLSchema-instance" xmlns:pc="http://schemas.microsoft.com/office/infopath/2007/PartnerControls">
   <documentManagement>
     <_activity xmlns="832fbaf3-3528-487e-86c7-310b19e1ba0a" xsi:nil="true"/>
@@ -22863,11 +23568,16 @@
 </p:properties>
 </file>
 
-<file path=customXml/item2.xml><?xml version="1.0" encoding="utf-8"?>
-<b:Sources xmlns:b="http://schemas.openxmlformats.org/officeDocument/2006/bibliography" xmlns="http://schemas.openxmlformats.org/officeDocument/2006/bibliography" SelectedStyle="/APA.XSL" StyleName="APA"/>
+<file path=customXml/item3.xml><?xml version="1.0" encoding="utf-8"?>
+<?mso-contentType ?>
+<FormTemplates xmlns="http://schemas.microsoft.com/sharepoint/v3/contenttype/forms">
+  <Display>DocumentLibraryForm</Display>
+  <Edit>DocumentLibraryForm</Edit>
+  <New>DocumentLibraryForm</New>
+</FormTemplates>
 </file>
 
-<file path=customXml/item3.xml><?xml version="1.0" encoding="utf-8"?>
+<file path=customXml/item4.xml><?xml version="1.0" encoding="utf-8"?>
 <ct:contentTypeSchema xmlns:ct="http://schemas.microsoft.com/office/2006/metadata/contentType" xmlns:ma="http://schemas.microsoft.com/office/2006/metadata/properties/metaAttributes" ct:_="" ma:_="" ma:contentTypeName="Dokumen" ma:contentTypeID="0x010100F3A13967BEA7A648BFEC685482FAB423" ma:contentTypeVersion="5" ma:contentTypeDescription="Buat sebuah dokumen baru." ma:contentTypeScope="" ma:versionID="9502ac6ba85e8c6f755e348327bd0baa">
   <xsd:schema xmlns:xsd="http://www.w3.org/2001/XMLSchema" xmlns:xs="http://www.w3.org/2001/XMLSchema" xmlns:p="http://schemas.microsoft.com/office/2006/metadata/properties" xmlns:ns3="832fbaf3-3528-487e-86c7-310b19e1ba0a" targetNamespace="http://schemas.microsoft.com/office/2006/metadata/properties" ma:root="true" ma:fieldsID="1d7df0770d63e585e53363b1a7fcbee7" ns3:_="">
     <xsd:import namespace="832fbaf3-3528-487e-86c7-310b19e1ba0a"/>
@@ -23017,16 +23727,15 @@
 </ct:contentTypeSchema>
 </file>
 
-<file path=customXml/item4.xml><?xml version="1.0" encoding="utf-8"?>
-<?mso-contentType ?>
-<FormTemplates xmlns="http://schemas.microsoft.com/sharepoint/v3/contenttype/forms">
-  <Display>DocumentLibraryForm</Display>
-  <Edit>DocumentLibraryForm</Edit>
-  <New>DocumentLibraryForm</New>
-</FormTemplates>
+<file path=customXml/itemProps1.xml><?xml version="1.0" encoding="utf-8"?>
+<ds:datastoreItem xmlns:ds="http://schemas.openxmlformats.org/officeDocument/2006/customXml" ds:itemID="{EF278816-EC6F-A645-907D-7F25AECB1D4A}">
+  <ds:schemaRefs>
+    <ds:schemaRef ds:uri="http://schemas.openxmlformats.org/officeDocument/2006/bibliography"/>
+  </ds:schemaRefs>
+</ds:datastoreItem>
 </file>
 
-<file path=customXml/itemProps1.xml><?xml version="1.0" encoding="utf-8"?>
+<file path=customXml/itemProps2.xml><?xml version="1.0" encoding="utf-8"?>
 <ds:datastoreItem xmlns:ds="http://schemas.openxmlformats.org/officeDocument/2006/customXml" ds:itemID="{73C95567-D348-41F0-8617-88C5BC80D04B}">
   <ds:schemaRefs>
     <ds:schemaRef ds:uri="http://schemas.microsoft.com/office/2006/metadata/properties"/>
@@ -23036,15 +23745,15 @@
 </ds:datastoreItem>
 </file>
 
-<file path=customXml/itemProps2.xml><?xml version="1.0" encoding="utf-8"?>
-<ds:datastoreItem xmlns:ds="http://schemas.openxmlformats.org/officeDocument/2006/customXml" ds:itemID="{EF278816-EC6F-A645-907D-7F25AECB1D4A}">
+<file path=customXml/itemProps3.xml><?xml version="1.0" encoding="utf-8"?>
+<ds:datastoreItem xmlns:ds="http://schemas.openxmlformats.org/officeDocument/2006/customXml" ds:itemID="{C5B6A082-A8D9-4F0D-B7E5-2EFA2FC8A6ED}">
   <ds:schemaRefs>
-    <ds:schemaRef ds:uri="http://schemas.openxmlformats.org/officeDocument/2006/bibliography"/>
+    <ds:schemaRef ds:uri="http://schemas.microsoft.com/sharepoint/v3/contenttype/forms"/>
   </ds:schemaRefs>
 </ds:datastoreItem>
 </file>
 
-<file path=customXml/itemProps3.xml><?xml version="1.0" encoding="utf-8"?>
+<file path=customXml/itemProps4.xml><?xml version="1.0" encoding="utf-8"?>
 <ds:datastoreItem xmlns:ds="http://schemas.openxmlformats.org/officeDocument/2006/customXml" ds:itemID="{6D6590A5-A733-4446-B034-17F8E4E12E57}">
   <ds:schemaRefs>
     <ds:schemaRef ds:uri="http://schemas.microsoft.com/office/2006/metadata/contentType"/>
@@ -23060,12 +23769,4 @@
     <ds:schemaRef ds:uri="http://schemas.microsoft.com/internal/obd"/>
   </ds:schemaRefs>
 </ds:datastoreItem>
-</file>
-
-<file path=customXml/itemProps4.xml><?xml version="1.0" encoding="utf-8"?>
-<ds:datastoreItem xmlns:ds="http://schemas.openxmlformats.org/officeDocument/2006/customXml" ds:itemID="{C5B6A082-A8D9-4F0D-B7E5-2EFA2FC8A6ED}">
-  <ds:schemaRefs>
-    <ds:schemaRef ds:uri="http://schemas.microsoft.com/sharepoint/v3/contenttype/forms"/>
-  </ds:schemaRefs>
-</ds:datastoreItem>
 </file>
</xml_diff>